<commit_message>
add linkedin jbbots automation
</commit_message>
<xml_diff>
--- a/linkedin_job_bot/input/Md_Irsad_ind.docx
+++ b/linkedin_job_bot/input/Md_Irsad_ind.docx
@@ -33,7 +33,14 @@
           <w:b/>
           <w:bCs/>
         </w:rPr>
-        <w:t>Full Stack Developer &amp; Data Engineer</w:t>
+        <w:t xml:space="preserve">Data Science </w:t>
+      </w:r>
+      <w:r>
+        <w:rPr>
+          <w:b/>
+          <w:bCs/>
+        </w:rPr>
+        <w:t>&amp; Data Engineer</w:t>
       </w:r>
       <w:r>
         <w:rPr>
@@ -238,274 +245,25 @@
           <w:sz w:val="20"/>
           <w:szCs w:val="20"/>
         </w:rPr>
-        <w:t>Full Stack Developer &amp; Data Engineer</w:t>
-      </w:r>
-      <w:r>
-        <w:rPr>
-          <w:rFonts w:ascii="Arial Nova Cond" w:hAnsi="Arial Nova Cond" w:cs="Calibri"/>
-          <w:color w:val="000000" w:themeColor="text1"/>
-          <w:sz w:val="20"/>
-          <w:szCs w:val="20"/>
-        </w:rPr>
-        <w:t xml:space="preserve"> </w:t>
-      </w:r>
-      <w:r>
-        <w:rPr>
-          <w:rFonts w:ascii="Arial Nova Cond" w:hAnsi="Arial Nova Cond" w:cs="Calibri"/>
-          <w:color w:val="000000" w:themeColor="text1"/>
-          <w:sz w:val="20"/>
-          <w:szCs w:val="20"/>
-        </w:rPr>
-        <w:t xml:space="preserve">with </w:t>
-      </w:r>
-      <w:r>
-        <w:rPr>
-          <w:rFonts w:ascii="Arial Nova Cond" w:hAnsi="Arial Nova Cond" w:cs="Calibri"/>
-          <w:color w:val="000000" w:themeColor="text1"/>
-          <w:sz w:val="20"/>
-          <w:szCs w:val="20"/>
-        </w:rPr>
-        <w:t>2+</w:t>
-      </w:r>
-      <w:r>
-        <w:rPr>
-          <w:rFonts w:ascii="Arial Nova Cond" w:hAnsi="Arial Nova Cond" w:cs="Calibri"/>
-          <w:color w:val="000000" w:themeColor="text1"/>
-          <w:sz w:val="20"/>
-          <w:szCs w:val="20"/>
-        </w:rPr>
-        <w:t xml:space="preserve"> years of experience</w:t>
-      </w:r>
-      <w:r>
-        <w:rPr>
-          <w:rFonts w:ascii="Arial Nova Cond" w:hAnsi="Arial Nova Cond" w:cs="Calibri"/>
-          <w:color w:val="000000" w:themeColor="text1"/>
-          <w:sz w:val="20"/>
-          <w:szCs w:val="20"/>
-        </w:rPr>
-        <w:t>, specializing in</w:t>
-      </w:r>
-      <w:r>
-        <w:rPr>
-          <w:rFonts w:ascii="Arial Nova Cond" w:hAnsi="Arial Nova Cond" w:cs="Calibri"/>
-          <w:color w:val="000000" w:themeColor="text1"/>
-          <w:sz w:val="20"/>
-          <w:szCs w:val="20"/>
-        </w:rPr>
-        <w:t xml:space="preserve"> </w:t>
-      </w:r>
-      <w:r>
-        <w:rPr>
-          <w:rFonts w:ascii="Arial Nova Cond" w:hAnsi="Arial Nova Cond" w:cs="Calibri"/>
-          <w:color w:val="000000" w:themeColor="text1"/>
-          <w:sz w:val="20"/>
-          <w:szCs w:val="20"/>
-        </w:rPr>
-        <w:t>React</w:t>
-      </w:r>
-      <w:r>
-        <w:rPr>
-          <w:rFonts w:ascii="Arial Nova Cond" w:hAnsi="Arial Nova Cond" w:cs="Calibri"/>
-          <w:color w:val="000000" w:themeColor="text1"/>
-          <w:sz w:val="20"/>
-          <w:szCs w:val="20"/>
-        </w:rPr>
-        <w:t>.js, Python,</w:t>
-      </w:r>
-      <w:r>
-        <w:rPr>
-          <w:rFonts w:ascii="Arial Nova Cond" w:hAnsi="Arial Nova Cond" w:cs="Calibri"/>
-          <w:color w:val="000000" w:themeColor="text1"/>
-          <w:sz w:val="20"/>
-          <w:szCs w:val="20"/>
-        </w:rPr>
-        <w:t xml:space="preserve"> AWS cloud </w:t>
-      </w:r>
-      <w:r>
-        <w:rPr>
-          <w:rFonts w:ascii="Arial Nova Cond" w:hAnsi="Arial Nova Cond" w:cs="Calibri"/>
-          <w:color w:val="000000" w:themeColor="text1"/>
-          <w:sz w:val="20"/>
-          <w:szCs w:val="20"/>
-        </w:rPr>
-        <w:t>T</w:t>
-      </w:r>
-      <w:r>
-        <w:rPr>
-          <w:rFonts w:ascii="Arial Nova Cond" w:hAnsi="Arial Nova Cond" w:cs="Calibri"/>
-          <w:color w:val="000000" w:themeColor="text1"/>
-          <w:sz w:val="20"/>
-          <w:szCs w:val="20"/>
-        </w:rPr>
-        <w:t xml:space="preserve">echnologies such as IAM, S3, EC2, Athena, Glue, AWS Step Functions, and CloudWatch. Proficient in crafting ETL </w:t>
-      </w:r>
-      <w:r>
-        <w:rPr>
-          <w:rFonts w:ascii="Arial Nova Cond" w:hAnsi="Arial Nova Cond" w:cs="Calibri"/>
-          <w:color w:val="000000" w:themeColor="text1"/>
-          <w:sz w:val="20"/>
-          <w:szCs w:val="20"/>
-        </w:rPr>
-        <w:t>P</w:t>
-      </w:r>
-      <w:r>
-        <w:rPr>
-          <w:rFonts w:ascii="Arial Nova Cond" w:hAnsi="Arial Nova Cond" w:cs="Calibri"/>
-          <w:color w:val="000000" w:themeColor="text1"/>
-          <w:sz w:val="20"/>
-          <w:szCs w:val="20"/>
-        </w:rPr>
-        <w:t xml:space="preserve">ipeline using Python, </w:t>
-      </w:r>
-      <w:r>
-        <w:rPr>
-          <w:rFonts w:ascii="Arial Nova Cond" w:hAnsi="Arial Nova Cond" w:cs="Calibri"/>
-          <w:color w:val="000000" w:themeColor="text1"/>
-          <w:sz w:val="20"/>
-          <w:szCs w:val="20"/>
-        </w:rPr>
-        <w:t xml:space="preserve">Pandas, </w:t>
-      </w:r>
-      <w:proofErr w:type="spellStart"/>
-      <w:r>
-        <w:rPr>
-          <w:rFonts w:ascii="Arial Nova Cond" w:hAnsi="Arial Nova Cond" w:cs="Calibri"/>
-          <w:color w:val="000000" w:themeColor="text1"/>
-          <w:sz w:val="20"/>
-          <w:szCs w:val="20"/>
-        </w:rPr>
-        <w:t>PySpark</w:t>
-      </w:r>
-      <w:proofErr w:type="spellEnd"/>
-      <w:r>
-        <w:rPr>
-          <w:rFonts w:ascii="Arial Nova Cond" w:hAnsi="Arial Nova Cond" w:cs="Calibri"/>
-          <w:color w:val="000000" w:themeColor="text1"/>
-          <w:sz w:val="20"/>
-          <w:szCs w:val="20"/>
-        </w:rPr>
-        <w:t xml:space="preserve">, and SQL to ensure efficient data transfer. </w:t>
-      </w:r>
-      <w:r>
-        <w:rPr>
-          <w:rFonts w:ascii="Arial Nova Cond" w:hAnsi="Arial Nova Cond" w:cs="Calibri"/>
-          <w:color w:val="000000" w:themeColor="text1"/>
-          <w:sz w:val="20"/>
-          <w:szCs w:val="20"/>
-        </w:rPr>
-        <w:t>Experience</w:t>
-      </w:r>
-      <w:r>
-        <w:rPr>
-          <w:rFonts w:ascii="Arial Nova Cond" w:hAnsi="Arial Nova Cond" w:cs="Calibri"/>
-          <w:color w:val="000000" w:themeColor="text1"/>
-          <w:sz w:val="20"/>
-          <w:szCs w:val="20"/>
-        </w:rPr>
-        <w:t xml:space="preserve"> in developing </w:t>
-      </w:r>
-      <w:r>
-        <w:rPr>
-          <w:rFonts w:ascii="Arial Nova Cond" w:hAnsi="Arial Nova Cond" w:cs="Calibri"/>
-          <w:color w:val="000000" w:themeColor="text1"/>
-          <w:sz w:val="20"/>
-          <w:szCs w:val="20"/>
-        </w:rPr>
-        <w:t>machine learning</w:t>
-      </w:r>
-      <w:r>
-        <w:rPr>
-          <w:rFonts w:ascii="Arial Nova Cond" w:hAnsi="Arial Nova Cond" w:cs="Calibri"/>
-          <w:color w:val="000000" w:themeColor="text1"/>
-          <w:sz w:val="20"/>
-          <w:szCs w:val="20"/>
-        </w:rPr>
-        <w:t xml:space="preserve"> algorithms, </w:t>
-      </w:r>
-      <w:r>
-        <w:rPr>
-          <w:rFonts w:ascii="Arial Nova Cond" w:hAnsi="Arial Nova Cond" w:cs="Calibri"/>
-          <w:color w:val="000000" w:themeColor="text1"/>
-          <w:sz w:val="20"/>
-          <w:szCs w:val="20"/>
-        </w:rPr>
-        <w:t xml:space="preserve">classification, </w:t>
-      </w:r>
-      <w:proofErr w:type="gramStart"/>
-      <w:r>
-        <w:rPr>
-          <w:rFonts w:ascii="Arial Nova Cond" w:hAnsi="Arial Nova Cond" w:cs="Calibri"/>
-          <w:color w:val="000000" w:themeColor="text1"/>
-          <w:sz w:val="20"/>
-          <w:szCs w:val="20"/>
-        </w:rPr>
-        <w:t>regression</w:t>
-      </w:r>
-      <w:proofErr w:type="gramEnd"/>
-      <w:r>
-        <w:rPr>
-          <w:rFonts w:ascii="Arial Nova Cond" w:hAnsi="Arial Nova Cond" w:cs="Calibri"/>
-          <w:color w:val="000000" w:themeColor="text1"/>
-          <w:sz w:val="20"/>
-          <w:szCs w:val="20"/>
-        </w:rPr>
-        <w:t xml:space="preserve"> and random forest etc.</w:t>
-      </w:r>
-      <w:r>
-        <w:rPr>
-          <w:rFonts w:ascii="Arial Nova Cond" w:hAnsi="Arial Nova Cond" w:cs="Calibri"/>
-          <w:color w:val="000000" w:themeColor="text1"/>
-          <w:sz w:val="20"/>
-          <w:szCs w:val="20"/>
-        </w:rPr>
-        <w:t xml:space="preserve"> </w:t>
-      </w:r>
-      <w:r>
-        <w:rPr>
-          <w:rFonts w:ascii="Arial Nova Cond" w:hAnsi="Arial Nova Cond" w:cs="Calibri"/>
-          <w:color w:val="000000" w:themeColor="text1"/>
-          <w:sz w:val="20"/>
-          <w:szCs w:val="20"/>
-        </w:rPr>
-        <w:t>Expertise</w:t>
-      </w:r>
-      <w:r>
-        <w:rPr>
-          <w:rFonts w:ascii="Arial Nova Cond" w:hAnsi="Arial Nova Cond" w:cs="Calibri"/>
-          <w:color w:val="000000" w:themeColor="text1"/>
-          <w:sz w:val="20"/>
-          <w:szCs w:val="20"/>
-        </w:rPr>
-        <w:t xml:space="preserve"> in performance optimization using caching and applying best practices through code reviews using </w:t>
-      </w:r>
-      <w:proofErr w:type="spellStart"/>
-      <w:r>
-        <w:rPr>
-          <w:rFonts w:ascii="Arial Nova Cond" w:hAnsi="Arial Nova Cond" w:cs="Calibri"/>
-          <w:color w:val="000000" w:themeColor="text1"/>
-          <w:sz w:val="20"/>
-          <w:szCs w:val="20"/>
-        </w:rPr>
-        <w:t>SonarLint</w:t>
-      </w:r>
-      <w:proofErr w:type="spellEnd"/>
-      <w:r>
-        <w:rPr>
-          <w:rFonts w:ascii="Arial Nova Cond" w:hAnsi="Arial Nova Cond" w:cs="Calibri"/>
-          <w:color w:val="000000" w:themeColor="text1"/>
-          <w:sz w:val="20"/>
-          <w:szCs w:val="20"/>
-        </w:rPr>
-        <w:t xml:space="preserve">/SonarQube, </w:t>
-      </w:r>
-      <w:r>
-        <w:rPr>
-          <w:rFonts w:ascii="Arial Nova Cond" w:hAnsi="Arial Nova Cond" w:cs="Calibri"/>
-          <w:color w:val="000000" w:themeColor="text1"/>
-          <w:sz w:val="20"/>
-          <w:szCs w:val="20"/>
-        </w:rPr>
-        <w:t>streamlining project setups using Conda and Poetry.</w:t>
+        <w:t xml:space="preserve">Data Engineer &amp; Python Developer with </w:t>
+      </w:r>
+      <w:r>
+        <w:rPr>
+          <w:rFonts w:ascii="Arial Nova Cond" w:hAnsi="Arial Nova Cond" w:cs="Calibri"/>
+          <w:color w:val="000000" w:themeColor="text1"/>
+          <w:sz w:val="20"/>
+          <w:szCs w:val="20"/>
+        </w:rPr>
+        <w:t>3</w:t>
+      </w:r>
+      <w:r>
+        <w:rPr>
+          <w:rFonts w:ascii="Arial Nova Cond" w:hAnsi="Arial Nova Cond" w:cs="Calibri"/>
+          <w:color w:val="000000" w:themeColor="text1"/>
+          <w:sz w:val="20"/>
+          <w:szCs w:val="20"/>
+        </w:rPr>
+        <w:t>+ years of experience in building scalable ETL pipelines, backend APIs, and automation workflows. Skilled in AWS (Glue, Lambda, Step Functions, S3, Redshift), SQL/MySQL, and Python (Pandas, PySpark, FastAPI). Strong track record of automating finance workflows, migrating legacy systems to cloud-native solutions, and optimizing database performance. Experienced in freelancing and full-time roles, delivering business impact by reducing manual effort and improving data processing efficiency.</w:t>
       </w:r>
     </w:p>
     <w:p>
@@ -559,28 +317,23 @@
     </w:p>
     <w:p>
       <w:pPr>
-        <w:widowControl w:val="0"/>
-        <w:overflowPunct w:val="0"/>
-        <w:autoSpaceDE w:val="0"/>
-        <w:autoSpaceDN w:val="0"/>
-        <w:adjustRightInd w:val="0"/>
-        <w:spacing w:after="0" w:line="240" w:lineRule="auto"/>
-        <w:jc w:val="both"/>
-        <w:rPr>
-          <w:rFonts w:ascii="Arial Nova Cond" w:hAnsi="Arial Nova Cond" w:cs="Calibri"/>
-          <w:color w:val="000000" w:themeColor="text1"/>
-          <w:sz w:val="20"/>
-          <w:szCs w:val="20"/>
-        </w:rPr>
-      </w:pPr>
-      <w:r>
-        <w:rPr>
-          <w:rFonts w:ascii="Arial Nova Cond" w:hAnsi="Arial Nova Cond" w:cs="Calibri"/>
-          <w:color w:val="000000" w:themeColor="text1"/>
-          <w:sz w:val="20"/>
-          <w:szCs w:val="20"/>
-        </w:rPr>
-        <w:t>Company1</w:t>
+        <w:suppressAutoHyphens/>
+        <w:spacing w:before="30" w:after="0" w:line="240" w:lineRule="auto"/>
+        <w:rPr>
+          <w:rFonts w:ascii="Arial Nova Cond" w:hAnsi="Arial Nova Cond" w:cs="Calibri"/>
+          <w:color w:val="000000" w:themeColor="text1"/>
+          <w:sz w:val="20"/>
+          <w:szCs w:val="20"/>
+        </w:rPr>
+      </w:pPr>
+      <w:r>
+        <w:rPr>
+          <w:rFonts w:ascii="Arial Nova Cond" w:hAnsi="Arial Nova Cond" w:cs="Calibri"/>
+          <w:color w:val="000000" w:themeColor="text1"/>
+          <w:sz w:val="20"/>
+          <w:szCs w:val="20"/>
+        </w:rPr>
+        <w:t xml:space="preserve">Company1       </w:t>
       </w:r>
       <w:r>
         <w:rPr>
@@ -608,82 +361,36 @@
           <w:szCs w:val="20"/>
         </w:rPr>
         <w:tab/>
-        <w:t xml:space="preserve">:  </w:t>
-      </w:r>
-      <w:proofErr w:type="gramStart"/>
-      <w:r>
-        <w:rPr>
-          <w:rFonts w:ascii="Arial Nova Cond" w:hAnsi="Arial Nova Cond" w:cs="Calibri"/>
-          <w:color w:val="000000" w:themeColor="text1"/>
-          <w:sz w:val="20"/>
-          <w:szCs w:val="20"/>
-        </w:rPr>
-        <w:t xml:space="preserve">Freelance  </w:t>
-      </w:r>
-      <w:r>
-        <w:rPr>
-          <w:rFonts w:ascii="Arial Nova Cond" w:hAnsi="Arial Nova Cond" w:cs="Calibri"/>
-          <w:color w:val="000000" w:themeColor="text1"/>
-          <w:sz w:val="20"/>
-          <w:szCs w:val="20"/>
-        </w:rPr>
-        <w:t>(</w:t>
-      </w:r>
-      <w:proofErr w:type="gramEnd"/>
-      <w:r>
-        <w:rPr>
-          <w:rFonts w:ascii="Arial Nova Cond" w:hAnsi="Arial Nova Cond" w:cs="Calibri"/>
-          <w:color w:val="000000" w:themeColor="text1"/>
-          <w:sz w:val="20"/>
-          <w:szCs w:val="20"/>
-        </w:rPr>
-        <w:t xml:space="preserve">Client: </w:t>
-      </w:r>
-      <w:proofErr w:type="spellStart"/>
-      <w:r>
-        <w:rPr>
-          <w:rFonts w:ascii="Arial Nova Cond" w:hAnsi="Arial Nova Cond" w:cs="Calibri"/>
-          <w:color w:val="000000" w:themeColor="text1"/>
-          <w:sz w:val="20"/>
-          <w:szCs w:val="20"/>
-        </w:rPr>
-        <w:t>HCLTech</w:t>
-      </w:r>
-      <w:proofErr w:type="spellEnd"/>
-      <w:r>
-        <w:rPr>
-          <w:rFonts w:ascii="Arial Nova Cond" w:hAnsi="Arial Nova Cond" w:cs="Calibri"/>
-          <w:color w:val="000000" w:themeColor="text1"/>
-          <w:sz w:val="20"/>
-          <w:szCs w:val="20"/>
-        </w:rPr>
-        <w:t>, MOTOR)</w:t>
+      </w:r>
+      <w:r>
+        <w:rPr>
+          <w:rFonts w:ascii="Arial Nova Cond" w:hAnsi="Arial Nova Cond" w:cs="Calibri"/>
+          <w:color w:val="000000" w:themeColor="text1"/>
+          <w:sz w:val="20"/>
+          <w:szCs w:val="20"/>
+        </w:rPr>
+        <w:t xml:space="preserve"> : Freelance (Contract for Client: HCLTech – MOTOR)</w:t>
       </w:r>
     </w:p>
     <w:p>
       <w:pPr>
-        <w:widowControl w:val="0"/>
-        <w:overflowPunct w:val="0"/>
-        <w:autoSpaceDE w:val="0"/>
-        <w:autoSpaceDN w:val="0"/>
-        <w:adjustRightInd w:val="0"/>
-        <w:spacing w:after="0" w:line="240" w:lineRule="auto"/>
-        <w:jc w:val="both"/>
-        <w:rPr>
-          <w:rFonts w:ascii="Arial Nova Cond" w:hAnsi="Arial Nova Cond" w:cs="Calibri"/>
-          <w:color w:val="000000" w:themeColor="text1"/>
-          <w:sz w:val="20"/>
-          <w:szCs w:val="20"/>
-        </w:rPr>
-      </w:pPr>
-      <w:r>
-        <w:rPr>
-          <w:rFonts w:ascii="Arial Nova Cond" w:hAnsi="Arial Nova Cond" w:cs="Calibri"/>
-          <w:color w:val="000000" w:themeColor="text1"/>
-          <w:sz w:val="20"/>
-          <w:szCs w:val="20"/>
-        </w:rPr>
-        <w:t>Designation</w:t>
+        <w:suppressAutoHyphens/>
+        <w:spacing w:before="30" w:after="0" w:line="240" w:lineRule="auto"/>
+        <w:rPr>
+          <w:rFonts w:ascii="Arial Nova Cond" w:hAnsi="Arial Nova Cond" w:cs="Calibri"/>
+          <w:color w:val="000000" w:themeColor="text1"/>
+          <w:sz w:val="20"/>
+          <w:szCs w:val="20"/>
+        </w:rPr>
+      </w:pPr>
+      <w:r>
+        <w:rPr>
+          <w:rFonts w:ascii="Arial Nova Cond" w:hAnsi="Arial Nova Cond" w:cs="Calibri"/>
+          <w:color w:val="000000" w:themeColor="text1"/>
+          <w:sz w:val="20"/>
+          <w:szCs w:val="20"/>
+        </w:rPr>
+        <w:t xml:space="preserve">Designation    </w:t>
       </w:r>
       <w:r>
         <w:rPr>
@@ -711,42 +418,36 @@
           <w:szCs w:val="20"/>
         </w:rPr>
         <w:tab/>
-        <w:t xml:space="preserve">:  </w:t>
-      </w:r>
-      <w:r>
-        <w:rPr>
-          <w:rFonts w:ascii="Arial Nova Cond" w:hAnsi="Arial Nova Cond" w:cs="Calibri"/>
-          <w:color w:val="000000" w:themeColor="text1"/>
-          <w:sz w:val="20"/>
-          <w:szCs w:val="20"/>
-        </w:rPr>
-        <w:t>Data Engineer</w:t>
+      </w:r>
+      <w:r>
+        <w:rPr>
+          <w:rFonts w:ascii="Arial Nova Cond" w:hAnsi="Arial Nova Cond" w:cs="Calibri"/>
+          <w:color w:val="000000" w:themeColor="text1"/>
+          <w:sz w:val="20"/>
+          <w:szCs w:val="20"/>
+        </w:rPr>
+        <w:t xml:space="preserve"> : Data Engineer</w:t>
       </w:r>
     </w:p>
     <w:p>
       <w:pPr>
-        <w:widowControl w:val="0"/>
-        <w:overflowPunct w:val="0"/>
-        <w:autoSpaceDE w:val="0"/>
-        <w:autoSpaceDN w:val="0"/>
-        <w:adjustRightInd w:val="0"/>
-        <w:spacing w:after="0" w:line="240" w:lineRule="auto"/>
-        <w:jc w:val="both"/>
-        <w:rPr>
-          <w:rFonts w:ascii="Arial Nova Cond" w:hAnsi="Arial Nova Cond" w:cs="Calibri"/>
-          <w:color w:val="000000" w:themeColor="text1"/>
-          <w:sz w:val="20"/>
-          <w:szCs w:val="20"/>
-        </w:rPr>
-      </w:pPr>
-      <w:r>
-        <w:rPr>
-          <w:rFonts w:ascii="Arial Nova Cond" w:hAnsi="Arial Nova Cond" w:cs="Calibri"/>
-          <w:color w:val="000000" w:themeColor="text1"/>
-          <w:sz w:val="20"/>
-          <w:szCs w:val="20"/>
-        </w:rPr>
-        <w:t>Period Of Employment</w:t>
+        <w:suppressAutoHyphens/>
+        <w:spacing w:before="30" w:after="0" w:line="240" w:lineRule="auto"/>
+        <w:rPr>
+          <w:rFonts w:ascii="Arial Nova Cond" w:hAnsi="Arial Nova Cond" w:cs="Calibri"/>
+          <w:color w:val="000000" w:themeColor="text1"/>
+          <w:sz w:val="20"/>
+          <w:szCs w:val="20"/>
+        </w:rPr>
+      </w:pPr>
+      <w:r>
+        <w:rPr>
+          <w:rFonts w:ascii="Arial Nova Cond" w:hAnsi="Arial Nova Cond" w:cs="Calibri"/>
+          <w:color w:val="000000" w:themeColor="text1"/>
+          <w:sz w:val="20"/>
+          <w:szCs w:val="20"/>
+        </w:rPr>
+        <w:t xml:space="preserve">Period         </w:t>
       </w:r>
       <w:r>
         <w:rPr>
@@ -765,180 +466,57 @@
           <w:szCs w:val="20"/>
         </w:rPr>
         <w:tab/>
-        <w:t xml:space="preserve">:  </w:t>
-      </w:r>
-      <w:r>
-        <w:rPr>
-          <w:rFonts w:ascii="Arial Nova Cond" w:hAnsi="Arial Nova Cond" w:cs="Calibri"/>
-          <w:color w:val="000000" w:themeColor="text1"/>
-          <w:sz w:val="20"/>
-          <w:szCs w:val="20"/>
-        </w:rPr>
-        <w:t>Feb</w:t>
-      </w:r>
-      <w:r>
-        <w:rPr>
-          <w:rFonts w:ascii="Arial Nova Cond" w:hAnsi="Arial Nova Cond" w:cs="Calibri"/>
-          <w:color w:val="000000" w:themeColor="text1"/>
-          <w:sz w:val="20"/>
-          <w:szCs w:val="20"/>
-        </w:rPr>
-        <w:t>-202</w:t>
-      </w:r>
-      <w:r>
-        <w:rPr>
-          <w:rFonts w:ascii="Arial Nova Cond" w:hAnsi="Arial Nova Cond" w:cs="Calibri"/>
-          <w:color w:val="000000" w:themeColor="text1"/>
-          <w:sz w:val="20"/>
-          <w:szCs w:val="20"/>
-        </w:rPr>
-        <w:t>5</w:t>
-      </w:r>
-      <w:r>
-        <w:rPr>
-          <w:rFonts w:ascii="Arial Nova Cond" w:hAnsi="Arial Nova Cond" w:cs="Calibri"/>
-          <w:color w:val="000000" w:themeColor="text1"/>
-          <w:sz w:val="20"/>
-          <w:szCs w:val="20"/>
-        </w:rPr>
-        <w:t xml:space="preserve"> To </w:t>
-      </w:r>
-      <w:proofErr w:type="gramStart"/>
-      <w:r>
-        <w:rPr>
-          <w:rFonts w:ascii="Arial Nova Cond" w:hAnsi="Arial Nova Cond" w:cs="Calibri"/>
-          <w:color w:val="000000" w:themeColor="text1"/>
-          <w:sz w:val="20"/>
-          <w:szCs w:val="20"/>
-        </w:rPr>
-        <w:t>Till</w:t>
-      </w:r>
-      <w:proofErr w:type="gramEnd"/>
-      <w:r>
-        <w:rPr>
-          <w:rFonts w:ascii="Arial Nova Cond" w:hAnsi="Arial Nova Cond" w:cs="Calibri"/>
-          <w:color w:val="000000" w:themeColor="text1"/>
-          <w:sz w:val="20"/>
-          <w:szCs w:val="20"/>
-        </w:rPr>
-        <w:t xml:space="preserve"> Date</w:t>
+      </w:r>
+      <w:r>
+        <w:rPr>
+          <w:rFonts w:ascii="Arial Nova Cond" w:hAnsi="Arial Nova Cond" w:cs="Calibri"/>
+          <w:color w:val="000000" w:themeColor="text1"/>
+          <w:sz w:val="20"/>
+          <w:szCs w:val="20"/>
+        </w:rPr>
+        <w:tab/>
+      </w:r>
+      <w:r>
+        <w:rPr>
+          <w:rFonts w:ascii="Arial Nova Cond" w:hAnsi="Arial Nova Cond" w:cs="Calibri"/>
+          <w:color w:val="000000" w:themeColor="text1"/>
+          <w:sz w:val="20"/>
+          <w:szCs w:val="20"/>
+        </w:rPr>
+        <w:t xml:space="preserve"> : Feb-2025 to Present</w:t>
       </w:r>
     </w:p>
     <w:p>
       <w:pPr>
-        <w:widowControl w:val="0"/>
-        <w:overflowPunct w:val="0"/>
-        <w:autoSpaceDE w:val="0"/>
-        <w:autoSpaceDN w:val="0"/>
-        <w:adjustRightInd w:val="0"/>
-        <w:spacing w:after="0" w:line="240" w:lineRule="auto"/>
-        <w:jc w:val="both"/>
-        <w:rPr>
-          <w:rFonts w:ascii="Arial Nova Cond" w:hAnsi="Arial Nova Cond" w:cs="Calibri"/>
-          <w:color w:val="000000" w:themeColor="text1"/>
-          <w:sz w:val="20"/>
-          <w:szCs w:val="20"/>
-        </w:rPr>
-      </w:pPr>
-      <w:r>
-        <w:rPr>
-          <w:rFonts w:ascii="Arial Nova Cond" w:hAnsi="Arial Nova Cond" w:cs="Calibri"/>
-          <w:color w:val="000000" w:themeColor="text1"/>
-          <w:sz w:val="20"/>
-          <w:szCs w:val="20"/>
-        </w:rPr>
-        <w:t>Company</w:t>
-      </w:r>
-      <w:r>
-        <w:rPr>
-          <w:rFonts w:ascii="Arial Nova Cond" w:hAnsi="Arial Nova Cond" w:cs="Calibri"/>
-          <w:color w:val="000000" w:themeColor="text1"/>
-          <w:sz w:val="20"/>
-          <w:szCs w:val="20"/>
-        </w:rPr>
-        <w:t>2</w:t>
-      </w:r>
-      <w:r>
-        <w:rPr>
-          <w:rFonts w:ascii="Arial Nova Cond" w:hAnsi="Arial Nova Cond" w:cs="Calibri"/>
-          <w:color w:val="000000" w:themeColor="text1"/>
-          <w:sz w:val="20"/>
-          <w:szCs w:val="20"/>
-        </w:rPr>
-        <w:tab/>
-      </w:r>
-      <w:r>
-        <w:rPr>
-          <w:rFonts w:ascii="Arial Nova Cond" w:hAnsi="Arial Nova Cond" w:cs="Calibri"/>
-          <w:color w:val="000000" w:themeColor="text1"/>
-          <w:sz w:val="20"/>
-          <w:szCs w:val="20"/>
-        </w:rPr>
-        <w:tab/>
-      </w:r>
-      <w:r>
-        <w:rPr>
-          <w:rFonts w:ascii="Arial Nova Cond" w:hAnsi="Arial Nova Cond" w:cs="Calibri"/>
-          <w:color w:val="000000" w:themeColor="text1"/>
-          <w:sz w:val="20"/>
-          <w:szCs w:val="20"/>
-        </w:rPr>
-        <w:tab/>
-        <w:t xml:space="preserve">:  </w:t>
-      </w:r>
-      <w:r>
-        <w:rPr>
-          <w:rFonts w:ascii="Arial Nova Cond" w:hAnsi="Arial Nova Cond" w:cs="Calibri"/>
-          <w:color w:val="000000" w:themeColor="text1"/>
-          <w:sz w:val="20"/>
-          <w:szCs w:val="20"/>
-        </w:rPr>
-        <w:t xml:space="preserve">33 Kuber India Advisory </w:t>
-      </w:r>
-      <w:proofErr w:type="spellStart"/>
-      <w:r>
-        <w:rPr>
-          <w:rFonts w:ascii="Arial Nova Cond" w:hAnsi="Arial Nova Cond" w:cs="Calibri"/>
-          <w:color w:val="000000" w:themeColor="text1"/>
-          <w:sz w:val="20"/>
-          <w:szCs w:val="20"/>
-        </w:rPr>
-        <w:t>Lpp</w:t>
-      </w:r>
-      <w:proofErr w:type="spellEnd"/>
-      <w:r>
-        <w:rPr>
-          <w:rFonts w:ascii="Arial Nova Cond" w:hAnsi="Arial Nova Cond" w:cs="Calibri"/>
-          <w:color w:val="000000" w:themeColor="text1"/>
-          <w:sz w:val="20"/>
-          <w:szCs w:val="20"/>
-        </w:rPr>
-        <w:t>.</w:t>
-      </w:r>
+        <w:suppressAutoHyphens/>
+        <w:spacing w:before="30" w:after="0" w:line="240" w:lineRule="auto"/>
+        <w:rPr>
+          <w:rFonts w:ascii="Arial Nova Cond" w:hAnsi="Arial Nova Cond" w:cs="Calibri"/>
+          <w:color w:val="000000" w:themeColor="text1"/>
+          <w:sz w:val="20"/>
+          <w:szCs w:val="20"/>
+        </w:rPr>
+      </w:pPr>
     </w:p>
     <w:p>
       <w:pPr>
-        <w:widowControl w:val="0"/>
-        <w:overflowPunct w:val="0"/>
-        <w:autoSpaceDE w:val="0"/>
-        <w:autoSpaceDN w:val="0"/>
-        <w:adjustRightInd w:val="0"/>
-        <w:spacing w:after="0" w:line="240" w:lineRule="auto"/>
-        <w:rPr>
-          <w:rFonts w:ascii="Arial Nova Cond" w:hAnsi="Arial Nova Cond" w:cs="Calibri"/>
-          <w:color w:val="000000" w:themeColor="text1"/>
-          <w:sz w:val="20"/>
-          <w:szCs w:val="20"/>
-        </w:rPr>
-      </w:pPr>
-      <w:r>
-        <w:rPr>
-          <w:rFonts w:ascii="Arial Nova Cond" w:hAnsi="Arial Nova Cond" w:cs="Calibri"/>
-          <w:color w:val="000000" w:themeColor="text1"/>
-          <w:sz w:val="20"/>
-          <w:szCs w:val="20"/>
-        </w:rPr>
-        <w:t>Designation</w:t>
+        <w:suppressAutoHyphens/>
+        <w:spacing w:before="30" w:after="0" w:line="240" w:lineRule="auto"/>
+        <w:rPr>
+          <w:rFonts w:ascii="Arial Nova Cond" w:hAnsi="Arial Nova Cond" w:cs="Calibri"/>
+          <w:color w:val="000000" w:themeColor="text1"/>
+          <w:sz w:val="20"/>
+          <w:szCs w:val="20"/>
+        </w:rPr>
+      </w:pPr>
+      <w:r>
+        <w:rPr>
+          <w:rFonts w:ascii="Arial Nova Cond" w:hAnsi="Arial Nova Cond" w:cs="Calibri"/>
+          <w:color w:val="000000" w:themeColor="text1"/>
+          <w:sz w:val="20"/>
+          <w:szCs w:val="20"/>
+        </w:rPr>
+        <w:t xml:space="preserve">Company2       </w:t>
       </w:r>
       <w:r>
         <w:rPr>
@@ -966,41 +544,36 @@
           <w:szCs w:val="20"/>
         </w:rPr>
         <w:tab/>
-        <w:t xml:space="preserve">:  Software </w:t>
-      </w:r>
-      <w:r>
-        <w:rPr>
-          <w:rFonts w:ascii="Arial Nova Cond" w:hAnsi="Arial Nova Cond" w:cs="Calibri"/>
-          <w:color w:val="000000" w:themeColor="text1"/>
-          <w:sz w:val="20"/>
-          <w:szCs w:val="20"/>
-        </w:rPr>
-        <w:t>Developer</w:t>
+      </w:r>
+      <w:r>
+        <w:rPr>
+          <w:rFonts w:ascii="Arial Nova Cond" w:hAnsi="Arial Nova Cond" w:cs="Calibri"/>
+          <w:color w:val="000000" w:themeColor="text1"/>
+          <w:sz w:val="20"/>
+          <w:szCs w:val="20"/>
+        </w:rPr>
+        <w:t xml:space="preserve"> : 33 Kuber India Advisory LLP</w:t>
       </w:r>
     </w:p>
     <w:p>
       <w:pPr>
-        <w:widowControl w:val="0"/>
-        <w:overflowPunct w:val="0"/>
-        <w:autoSpaceDE w:val="0"/>
-        <w:autoSpaceDN w:val="0"/>
-        <w:adjustRightInd w:val="0"/>
-        <w:spacing w:after="0" w:line="240" w:lineRule="auto"/>
-        <w:rPr>
-          <w:rFonts w:ascii="Arial Nova Cond" w:hAnsi="Arial Nova Cond" w:cs="Calibri"/>
-          <w:color w:val="000000" w:themeColor="text1"/>
-          <w:sz w:val="20"/>
-          <w:szCs w:val="20"/>
-        </w:rPr>
-      </w:pPr>
-      <w:r>
-        <w:rPr>
-          <w:rFonts w:ascii="Arial Nova Cond" w:hAnsi="Arial Nova Cond" w:cs="Calibri"/>
-          <w:color w:val="000000" w:themeColor="text1"/>
-          <w:sz w:val="20"/>
-          <w:szCs w:val="20"/>
-        </w:rPr>
-        <w:t>Period Of Employment</w:t>
+        <w:suppressAutoHyphens/>
+        <w:spacing w:before="30" w:after="0" w:line="240" w:lineRule="auto"/>
+        <w:rPr>
+          <w:rFonts w:ascii="Arial Nova Cond" w:hAnsi="Arial Nova Cond" w:cs="Calibri"/>
+          <w:color w:val="000000" w:themeColor="text1"/>
+          <w:sz w:val="20"/>
+          <w:szCs w:val="20"/>
+        </w:rPr>
+      </w:pPr>
+      <w:r>
+        <w:rPr>
+          <w:rFonts w:ascii="Arial Nova Cond" w:hAnsi="Arial Nova Cond" w:cs="Calibri"/>
+          <w:color w:val="000000" w:themeColor="text1"/>
+          <w:sz w:val="20"/>
+          <w:szCs w:val="20"/>
+        </w:rPr>
+        <w:t xml:space="preserve">Designation    </w:t>
       </w:r>
       <w:r>
         <w:rPr>
@@ -1019,70 +592,81 @@
           <w:szCs w:val="20"/>
         </w:rPr>
         <w:tab/>
-        <w:t xml:space="preserve">:  </w:t>
-      </w:r>
-      <w:r>
-        <w:rPr>
-          <w:rFonts w:ascii="Arial Nova Cond" w:hAnsi="Arial Nova Cond" w:cs="Calibri"/>
-          <w:color w:val="000000" w:themeColor="text1"/>
-          <w:sz w:val="20"/>
-          <w:szCs w:val="20"/>
-        </w:rPr>
-        <w:t>Sep</w:t>
-      </w:r>
-      <w:r>
-        <w:rPr>
-          <w:rFonts w:ascii="Arial Nova Cond" w:hAnsi="Arial Nova Cond" w:cs="Calibri"/>
-          <w:color w:val="000000" w:themeColor="text1"/>
-          <w:sz w:val="20"/>
-          <w:szCs w:val="20"/>
-        </w:rPr>
-        <w:t>-</w:t>
-      </w:r>
-      <w:r>
-        <w:rPr>
-          <w:rFonts w:ascii="Arial Nova Cond" w:hAnsi="Arial Nova Cond" w:cs="Calibri"/>
-          <w:color w:val="000000" w:themeColor="text1"/>
-          <w:sz w:val="20"/>
-          <w:szCs w:val="20"/>
-        </w:rPr>
-        <w:t>2023</w:t>
-      </w:r>
-      <w:r>
-        <w:rPr>
-          <w:rFonts w:ascii="Arial Nova Cond" w:hAnsi="Arial Nova Cond" w:cs="Calibri"/>
-          <w:color w:val="000000" w:themeColor="text1"/>
-          <w:sz w:val="20"/>
-          <w:szCs w:val="20"/>
-        </w:rPr>
-        <w:t xml:space="preserve"> To </w:t>
-      </w:r>
-      <w:r>
-        <w:rPr>
-          <w:rFonts w:ascii="Arial Nova Cond" w:hAnsi="Arial Nova Cond" w:cs="Calibri"/>
-          <w:color w:val="000000" w:themeColor="text1"/>
-          <w:sz w:val="20"/>
-          <w:szCs w:val="20"/>
-        </w:rPr>
-        <w:t>Jan</w:t>
-      </w:r>
-      <w:r>
-        <w:rPr>
-          <w:rFonts w:ascii="Arial Nova Cond" w:hAnsi="Arial Nova Cond" w:cs="Calibri"/>
-          <w:color w:val="000000" w:themeColor="text1"/>
-          <w:sz w:val="20"/>
-          <w:szCs w:val="20"/>
-        </w:rPr>
-        <w:t>-202</w:t>
-      </w:r>
-      <w:r>
-        <w:rPr>
-          <w:rFonts w:ascii="Arial Nova Cond" w:hAnsi="Arial Nova Cond" w:cs="Calibri"/>
-          <w:color w:val="000000" w:themeColor="text1"/>
-          <w:sz w:val="20"/>
-          <w:szCs w:val="20"/>
-        </w:rPr>
-        <w:t>5</w:t>
+      </w:r>
+      <w:r>
+        <w:rPr>
+          <w:rFonts w:ascii="Arial Nova Cond" w:hAnsi="Arial Nova Cond" w:cs="Calibri"/>
+          <w:color w:val="000000" w:themeColor="text1"/>
+          <w:sz w:val="20"/>
+          <w:szCs w:val="20"/>
+        </w:rPr>
+        <w:tab/>
+      </w:r>
+      <w:r>
+        <w:rPr>
+          <w:rFonts w:ascii="Arial Nova Cond" w:hAnsi="Arial Nova Cond" w:cs="Calibri"/>
+          <w:color w:val="000000" w:themeColor="text1"/>
+          <w:sz w:val="20"/>
+          <w:szCs w:val="20"/>
+        </w:rPr>
+        <w:t xml:space="preserve"> : Software Developer</w:t>
+      </w:r>
+    </w:p>
+    <w:p>
+      <w:pPr>
+        <w:suppressAutoHyphens/>
+        <w:spacing w:before="30" w:after="0" w:line="240" w:lineRule="auto"/>
+        <w:rPr>
+          <w:rFonts w:ascii="Arial Nova Cond" w:hAnsi="Arial Nova Cond" w:cs="Calibri"/>
+          <w:color w:val="000000" w:themeColor="text1"/>
+          <w:sz w:val="20"/>
+          <w:szCs w:val="20"/>
+        </w:rPr>
+      </w:pPr>
+      <w:r>
+        <w:rPr>
+          <w:rFonts w:ascii="Arial Nova Cond" w:hAnsi="Arial Nova Cond" w:cs="Calibri"/>
+          <w:color w:val="000000" w:themeColor="text1"/>
+          <w:sz w:val="20"/>
+          <w:szCs w:val="20"/>
+        </w:rPr>
+        <w:t xml:space="preserve">Period         </w:t>
+      </w:r>
+      <w:r>
+        <w:rPr>
+          <w:rFonts w:ascii="Arial Nova Cond" w:hAnsi="Arial Nova Cond" w:cs="Calibri"/>
+          <w:color w:val="000000" w:themeColor="text1"/>
+          <w:sz w:val="20"/>
+          <w:szCs w:val="20"/>
+        </w:rPr>
+        <w:tab/>
+      </w:r>
+      <w:r>
+        <w:rPr>
+          <w:rFonts w:ascii="Arial Nova Cond" w:hAnsi="Arial Nova Cond" w:cs="Calibri"/>
+          <w:color w:val="000000" w:themeColor="text1"/>
+          <w:sz w:val="20"/>
+          <w:szCs w:val="20"/>
+        </w:rPr>
+        <w:tab/>
+      </w:r>
+      <w:r>
+        <w:rPr>
+          <w:rFonts w:ascii="Arial Nova Cond" w:hAnsi="Arial Nova Cond" w:cs="Calibri"/>
+          <w:color w:val="000000" w:themeColor="text1"/>
+          <w:sz w:val="20"/>
+          <w:szCs w:val="20"/>
+        </w:rPr>
+        <w:tab/>
+      </w:r>
+      <w:r>
+        <w:rPr>
+          <w:rFonts w:ascii="Arial Nova Cond" w:hAnsi="Arial Nova Cond" w:cs="Calibri"/>
+          <w:color w:val="000000" w:themeColor="text1"/>
+          <w:sz w:val="20"/>
+          <w:szCs w:val="20"/>
+        </w:rPr>
+        <w:t xml:space="preserve"> : Sep-2023 to Jan-2025</w:t>
       </w:r>
     </w:p>
     <w:p>
@@ -1125,22 +709,22 @@
     <w:tbl>
       <w:tblPr>
         <w:tblStyle w:val="TableGrid"/>
-        <w:tblW w:w="5000" w:type="pct"/>
+        <w:tblW w:w="5299" w:type="pct"/>
         <w:tblInd w:w="-5" w:type="dxa"/>
         <w:tblLayout w:type="fixed"/>
         <w:tblLook w:val="04A0" w:firstRow="1" w:lastRow="0" w:firstColumn="1" w:lastColumn="0" w:noHBand="0" w:noVBand="1"/>
       </w:tblPr>
       <w:tblGrid>
-        <w:gridCol w:w="2186"/>
-        <w:gridCol w:w="6831"/>
+        <w:gridCol w:w="2551"/>
+        <w:gridCol w:w="7005"/>
       </w:tblGrid>
       <w:tr>
         <w:trPr>
-          <w:trHeight w:val="665"/>
+          <w:trHeight w:val="699"/>
         </w:trPr>
         <w:tc>
           <w:tcPr>
-            <w:tcW w:w="1212" w:type="pct"/>
+            <w:tcW w:w="1335" w:type="pct"/>
             <w:shd w:val="clear" w:color="auto" w:fill="ABCDEF"/>
           </w:tcPr>
           <w:p>
@@ -1167,7 +751,7 @@
         </w:tc>
         <w:tc>
           <w:tcPr>
-            <w:tcW w:w="3788" w:type="pct"/>
+            <w:tcW w:w="3665" w:type="pct"/>
             <w:shd w:val="clear" w:color="auto" w:fill="ABCDEF"/>
           </w:tcPr>
           <w:p>
@@ -1194,9 +778,12 @@
         </w:tc>
       </w:tr>
       <w:tr>
+        <w:trPr>
+          <w:trHeight w:val="631"/>
+        </w:trPr>
         <w:tc>
           <w:tcPr>
-            <w:tcW w:w="1212" w:type="pct"/>
+            <w:tcW w:w="1335" w:type="pct"/>
           </w:tcPr>
           <w:p>
             <w:pPr>
@@ -1215,13 +802,13 @@
                 <w:color w:val="000000" w:themeColor="text1"/>
                 <w:sz w:val="20"/>
               </w:rPr>
-              <w:t>Amazon Web Services</w:t>
+              <w:t>Cloud &amp; Data Engineering</w:t>
             </w:r>
           </w:p>
         </w:tc>
         <w:tc>
           <w:tcPr>
-            <w:tcW w:w="3788" w:type="pct"/>
+            <w:tcW w:w="3665" w:type="pct"/>
           </w:tcPr>
           <w:p>
             <w:pPr>
@@ -1240,15 +827,18 @@
                 <w:color w:val="000000" w:themeColor="text1"/>
                 <w:sz w:val="20"/>
               </w:rPr>
-              <w:t>IAM, EC2, S3, Glue, Lambda, Step Functions, SNS, SQS, CloudWatch, Athena, Redshift, DynamoDB, API Gateway, EC2, ECS, ECR, AWS Cognito, Python, AWS Toolkit etc.</w:t>
+              <w:t>AWS (S3, Lambda, Glue, Athena, Step Functions, DynamoDB, Redshift, CloudWatch, SNS/SQS, IAM, API Gateway, ECR, ECS, Cognito)</w:t>
             </w:r>
           </w:p>
         </w:tc>
       </w:tr>
       <w:tr>
+        <w:trPr>
+          <w:trHeight w:val="631"/>
+        </w:trPr>
         <w:tc>
           <w:tcPr>
-            <w:tcW w:w="1212" w:type="pct"/>
+            <w:tcW w:w="1335" w:type="pct"/>
           </w:tcPr>
           <w:p>
             <w:pPr>
@@ -1267,13 +857,13 @@
                 <w:color w:val="000000" w:themeColor="text1"/>
                 <w:sz w:val="20"/>
               </w:rPr>
-              <w:t>Python and Tools/Libs</w:t>
+              <w:t>Programming &amp; Frameworks</w:t>
             </w:r>
           </w:p>
         </w:tc>
         <w:tc>
           <w:tcPr>
-            <w:tcW w:w="3788" w:type="pct"/>
+            <w:tcW w:w="3665" w:type="pct"/>
           </w:tcPr>
           <w:p>
             <w:pPr>
@@ -1292,61 +882,7 @@
                 <w:color w:val="000000" w:themeColor="text1"/>
                 <w:sz w:val="20"/>
               </w:rPr>
-              <w:t xml:space="preserve">Python 3.8/3.9, </w:t>
-            </w:r>
-            <w:proofErr w:type="spellStart"/>
-            <w:r>
-              <w:rPr>
-                <w:rFonts w:ascii="Arial Nova Cond" w:hAnsi="Arial Nova Cond"/>
-                <w:color w:val="000000" w:themeColor="text1"/>
-                <w:sz w:val="20"/>
-              </w:rPr>
-              <w:t>FastAPI</w:t>
-            </w:r>
-            <w:proofErr w:type="spellEnd"/>
-            <w:r>
-              <w:rPr>
-                <w:rFonts w:ascii="Arial Nova Cond" w:hAnsi="Arial Nova Cond"/>
-                <w:color w:val="000000" w:themeColor="text1"/>
-                <w:sz w:val="20"/>
-              </w:rPr>
-              <w:t xml:space="preserve">, Anaconda, </w:t>
-            </w:r>
-            <w:proofErr w:type="spellStart"/>
-            <w:r>
-              <w:rPr>
-                <w:rFonts w:ascii="Arial Nova Cond" w:hAnsi="Arial Nova Cond"/>
-                <w:color w:val="000000" w:themeColor="text1"/>
-                <w:sz w:val="20"/>
-              </w:rPr>
-              <w:t>Jupyter</w:t>
-            </w:r>
-            <w:proofErr w:type="spellEnd"/>
-            <w:r>
-              <w:rPr>
-                <w:rFonts w:ascii="Arial Nova Cond" w:hAnsi="Arial Nova Cond"/>
-                <w:color w:val="000000" w:themeColor="text1"/>
-                <w:sz w:val="20"/>
-              </w:rPr>
-              <w:t xml:space="preserve"> Notebook, csv, pandas, scikit-learn, </w:t>
-            </w:r>
-            <w:proofErr w:type="spellStart"/>
-            <w:r>
-              <w:rPr>
-                <w:rFonts w:ascii="Arial Nova Cond" w:hAnsi="Arial Nova Cond"/>
-                <w:color w:val="000000" w:themeColor="text1"/>
-                <w:sz w:val="20"/>
-              </w:rPr>
-              <w:t>pyspark</w:t>
-            </w:r>
-            <w:proofErr w:type="spellEnd"/>
-            <w:r>
-              <w:rPr>
-                <w:rFonts w:ascii="Arial Nova Cond" w:hAnsi="Arial Nova Cond"/>
-                <w:color w:val="000000" w:themeColor="text1"/>
-                <w:sz w:val="20"/>
-              </w:rPr>
-              <w:t xml:space="preserve">, </w:t>
+              <w:t>Python (3.</w:t>
             </w:r>
             <w:r>
               <w:rPr>
@@ -1354,7 +890,7 @@
                 <w:color w:val="000000" w:themeColor="text1"/>
                 <w:sz w:val="20"/>
               </w:rPr>
-              <w:t>NumPy</w:t>
+              <w:t>12</w:t>
             </w:r>
             <w:r>
               <w:rPr>
@@ -1362,123 +898,34 @@
                 <w:color w:val="000000" w:themeColor="text1"/>
                 <w:sz w:val="20"/>
               </w:rPr>
-              <w:t xml:space="preserve">, </w:t>
+              <w:t>/3.1</w:t>
             </w:r>
-            <w:proofErr w:type="spellStart"/>
             <w:r>
               <w:rPr>
                 <w:rFonts w:ascii="Arial Nova Cond" w:hAnsi="Arial Nova Cond"/>
                 <w:color w:val="000000" w:themeColor="text1"/>
                 <w:sz w:val="20"/>
               </w:rPr>
-              <w:t>pyarrow</w:t>
+              <w:t>3</w:t>
             </w:r>
-            <w:proofErr w:type="spellEnd"/>
             <w:r>
               <w:rPr>
                 <w:rFonts w:ascii="Arial Nova Cond" w:hAnsi="Arial Nova Cond"/>
                 <w:color w:val="000000" w:themeColor="text1"/>
                 <w:sz w:val="20"/>
               </w:rPr>
-              <w:t xml:space="preserve">, boto3, </w:t>
-            </w:r>
-            <w:proofErr w:type="spellStart"/>
-            <w:r>
-              <w:rPr>
-                <w:rFonts w:ascii="Arial Nova Cond" w:hAnsi="Arial Nova Cond"/>
-                <w:color w:val="000000" w:themeColor="text1"/>
-                <w:sz w:val="20"/>
-              </w:rPr>
-              <w:t>json</w:t>
-            </w:r>
-            <w:proofErr w:type="spellEnd"/>
-            <w:r>
-              <w:rPr>
-                <w:rFonts w:ascii="Arial Nova Cond" w:hAnsi="Arial Nova Cond"/>
-                <w:color w:val="000000" w:themeColor="text1"/>
-                <w:sz w:val="20"/>
-              </w:rPr>
-              <w:t xml:space="preserve">, urllib3, </w:t>
-            </w:r>
-            <w:proofErr w:type="spellStart"/>
-            <w:r>
-              <w:rPr>
-                <w:rFonts w:ascii="Arial Nova Cond" w:hAnsi="Arial Nova Cond"/>
-                <w:color w:val="000000" w:themeColor="text1"/>
-                <w:sz w:val="20"/>
-              </w:rPr>
-              <w:t>hashlib</w:t>
-            </w:r>
-            <w:proofErr w:type="spellEnd"/>
-            <w:r>
-              <w:rPr>
-                <w:rFonts w:ascii="Arial Nova Cond" w:hAnsi="Arial Nova Cond"/>
-                <w:color w:val="000000" w:themeColor="text1"/>
-                <w:sz w:val="20"/>
-              </w:rPr>
-              <w:t xml:space="preserve">, logging, </w:t>
-            </w:r>
-            <w:proofErr w:type="spellStart"/>
-            <w:r>
-              <w:rPr>
-                <w:rFonts w:ascii="Arial Nova Cond" w:hAnsi="Arial Nova Cond"/>
-                <w:color w:val="000000" w:themeColor="text1"/>
-                <w:sz w:val="20"/>
-              </w:rPr>
-              <w:t>os</w:t>
-            </w:r>
-            <w:proofErr w:type="spellEnd"/>
-            <w:r>
-              <w:rPr>
-                <w:rFonts w:ascii="Arial Nova Cond" w:hAnsi="Arial Nova Cond"/>
-                <w:color w:val="000000" w:themeColor="text1"/>
-                <w:sz w:val="20"/>
-              </w:rPr>
-              <w:t xml:space="preserve">, glob, io, sys, </w:t>
-            </w:r>
-            <w:proofErr w:type="spellStart"/>
-            <w:r>
-              <w:rPr>
-                <w:rFonts w:ascii="Arial Nova Cond" w:hAnsi="Arial Nova Cond"/>
-                <w:color w:val="000000" w:themeColor="text1"/>
-                <w:sz w:val="20"/>
-              </w:rPr>
-              <w:t>unittest</w:t>
-            </w:r>
-            <w:proofErr w:type="spellEnd"/>
-            <w:r>
-              <w:rPr>
-                <w:rFonts w:ascii="Arial Nova Cond" w:hAnsi="Arial Nova Cond"/>
-                <w:color w:val="000000" w:themeColor="text1"/>
-                <w:sz w:val="20"/>
-              </w:rPr>
-              <w:t xml:space="preserve">, </w:t>
-            </w:r>
-            <w:proofErr w:type="spellStart"/>
-            <w:r>
-              <w:rPr>
-                <w:rFonts w:ascii="Arial Nova Cond" w:hAnsi="Arial Nova Cond"/>
-                <w:color w:val="000000" w:themeColor="text1"/>
-                <w:sz w:val="20"/>
-              </w:rPr>
-              <w:t>pytest</w:t>
-            </w:r>
-            <w:proofErr w:type="spellEnd"/>
-            <w:r>
-              <w:rPr>
-                <w:rFonts w:ascii="Arial Nova Cond" w:hAnsi="Arial Nova Cond"/>
-                <w:color w:val="000000" w:themeColor="text1"/>
-                <w:sz w:val="20"/>
-              </w:rPr>
-              <w:t xml:space="preserve"> etc.</w:t>
+              <w:t>), FastAPI, Flask, Pandas, NumPy, PySpark, SQLAlchemy, Boto3, REST APIs</w:t>
             </w:r>
           </w:p>
         </w:tc>
       </w:tr>
       <w:tr>
+        <w:trPr>
+          <w:trHeight w:val="378"/>
+        </w:trPr>
         <w:tc>
           <w:tcPr>
-            <w:tcW w:w="1212" w:type="pct"/>
+            <w:tcW w:w="1335" w:type="pct"/>
           </w:tcPr>
           <w:p>
             <w:pPr>
@@ -1497,13 +944,13 @@
                 <w:color w:val="000000" w:themeColor="text1"/>
                 <w:sz w:val="20"/>
               </w:rPr>
-              <w:t>Database</w:t>
+              <w:t>Data &amp; Databases</w:t>
             </w:r>
           </w:p>
         </w:tc>
         <w:tc>
           <w:tcPr>
-            <w:tcW w:w="3788" w:type="pct"/>
+            <w:tcW w:w="3665" w:type="pct"/>
           </w:tcPr>
           <w:p>
             <w:pPr>
@@ -1522,18 +969,18 @@
                 <w:color w:val="000000" w:themeColor="text1"/>
                 <w:sz w:val="20"/>
               </w:rPr>
-              <w:t>SQL, MySQL, AWS Athena, DynamoDB</w:t>
+              <w:t>MySQL, SQL, AWS Athena, DynamoDB, Redshift</w:t>
             </w:r>
           </w:p>
         </w:tc>
       </w:tr>
       <w:tr>
         <w:trPr>
-          <w:trHeight w:val="350"/>
+          <w:trHeight w:val="368"/>
         </w:trPr>
         <w:tc>
           <w:tcPr>
-            <w:tcW w:w="1212" w:type="pct"/>
+            <w:tcW w:w="1335" w:type="pct"/>
           </w:tcPr>
           <w:p>
             <w:pPr>
@@ -1552,81 +999,13 @@
                 <w:color w:val="000000" w:themeColor="text1"/>
                 <w:sz w:val="20"/>
               </w:rPr>
-              <w:t>Python Testing Tools</w:t>
+              <w:t>Automation &amp; Tools</w:t>
             </w:r>
           </w:p>
         </w:tc>
         <w:tc>
           <w:tcPr>
-            <w:tcW w:w="3788" w:type="pct"/>
-          </w:tcPr>
-          <w:p>
-            <w:pPr>
-              <w:pStyle w:val="BodyText2"/>
-              <w:spacing w:after="0"/>
-              <w:jc w:val="left"/>
-              <w:rPr>
-                <w:rFonts w:ascii="Arial Nova Cond" w:hAnsi="Arial Nova Cond"/>
-                <w:color w:val="000000" w:themeColor="text1"/>
-                <w:sz w:val="20"/>
-              </w:rPr>
-            </w:pPr>
-            <w:proofErr w:type="spellStart"/>
-            <w:r>
-              <w:rPr>
-                <w:rFonts w:ascii="Arial Nova Cond" w:hAnsi="Arial Nova Cond"/>
-                <w:color w:val="000000" w:themeColor="text1"/>
-                <w:sz w:val="20"/>
-              </w:rPr>
-              <w:t>Unittest</w:t>
-            </w:r>
-            <w:proofErr w:type="spellEnd"/>
-            <w:r>
-              <w:rPr>
-                <w:rFonts w:ascii="Arial Nova Cond" w:hAnsi="Arial Nova Cond"/>
-                <w:color w:val="000000" w:themeColor="text1"/>
-                <w:sz w:val="20"/>
-              </w:rPr>
-              <w:t xml:space="preserve">, </w:t>
-            </w:r>
-            <w:proofErr w:type="spellStart"/>
-            <w:r>
-              <w:rPr>
-                <w:rFonts w:ascii="Arial Nova Cond" w:hAnsi="Arial Nova Cond"/>
-                <w:color w:val="000000" w:themeColor="text1"/>
-                <w:sz w:val="20"/>
-              </w:rPr>
-              <w:t>Pytest</w:t>
-            </w:r>
-            <w:proofErr w:type="spellEnd"/>
-            <w:r>
-              <w:rPr>
-                <w:rFonts w:ascii="Arial Nova Cond" w:hAnsi="Arial Nova Cond"/>
-                <w:color w:val="000000" w:themeColor="text1"/>
-                <w:sz w:val="20"/>
-              </w:rPr>
-              <w:t xml:space="preserve">, Docker </w:t>
-            </w:r>
-            <w:proofErr w:type="spellStart"/>
-            <w:r>
-              <w:rPr>
-                <w:rFonts w:ascii="Arial Nova Cond" w:hAnsi="Arial Nova Cond"/>
-                <w:color w:val="000000" w:themeColor="text1"/>
-                <w:sz w:val="20"/>
-              </w:rPr>
-              <w:t>Testcontainer</w:t>
-            </w:r>
-            <w:proofErr w:type="spellEnd"/>
-          </w:p>
-        </w:tc>
-      </w:tr>
-      <w:tr>
-        <w:trPr>
-          <w:trHeight w:val="440"/>
-        </w:trPr>
-        <w:tc>
-          <w:tcPr>
-            <w:tcW w:w="1212" w:type="pct"/>
+            <w:tcW w:w="3665" w:type="pct"/>
           </w:tcPr>
           <w:p>
             <w:pPr>
@@ -1645,13 +1024,18 @@
                 <w:color w:val="000000" w:themeColor="text1"/>
                 <w:sz w:val="20"/>
               </w:rPr>
-              <w:t>React</w:t>
+              <w:t>Selenium, Poetry, Anaconda, Jupyter Notebook, Docker, Git/GitHub, CI/CD</w:t>
             </w:r>
           </w:p>
         </w:tc>
+      </w:tr>
+      <w:tr>
+        <w:trPr>
+          <w:trHeight w:val="463"/>
+        </w:trPr>
         <w:tc>
           <w:tcPr>
-            <w:tcW w:w="3788" w:type="pct"/>
+            <w:tcW w:w="1335" w:type="pct"/>
           </w:tcPr>
           <w:p>
             <w:pPr>
@@ -1670,51 +1054,13 @@
                 <w:color w:val="000000" w:themeColor="text1"/>
                 <w:sz w:val="20"/>
               </w:rPr>
-              <w:t xml:space="preserve">Next.js, Nest.js, Node.js, Express.js, Tailwind CSS, React.js, React components, Context API, hooks, </w:t>
-            </w:r>
-            <w:proofErr w:type="spellStart"/>
-            <w:r>
-              <w:rPr>
-                <w:rFonts w:ascii="Arial Nova Cond" w:hAnsi="Arial Nova Cond"/>
-                <w:color w:val="000000" w:themeColor="text1"/>
-                <w:sz w:val="20"/>
-              </w:rPr>
-              <w:t>useState</w:t>
-            </w:r>
-            <w:proofErr w:type="spellEnd"/>
-            <w:r>
-              <w:rPr>
-                <w:rFonts w:ascii="Arial Nova Cond" w:hAnsi="Arial Nova Cond"/>
-                <w:color w:val="000000" w:themeColor="text1"/>
-                <w:sz w:val="20"/>
-              </w:rPr>
-              <w:t xml:space="preserve">, </w:t>
-            </w:r>
-            <w:proofErr w:type="spellStart"/>
-            <w:r>
-              <w:rPr>
-                <w:rFonts w:ascii="Arial Nova Cond" w:hAnsi="Arial Nova Cond"/>
-                <w:color w:val="000000" w:themeColor="text1"/>
-                <w:sz w:val="20"/>
-              </w:rPr>
-              <w:t>useEffect</w:t>
-            </w:r>
-            <w:proofErr w:type="spellEnd"/>
-            <w:r>
-              <w:rPr>
-                <w:rFonts w:ascii="Arial Nova Cond" w:hAnsi="Arial Nova Cond"/>
-                <w:color w:val="000000" w:themeColor="text1"/>
-                <w:sz w:val="20"/>
-              </w:rPr>
-              <w:t>, Axios API, JavaScript ES6+ etc.</w:t>
+              <w:t>Testing &amp; Quality</w:t>
             </w:r>
           </w:p>
         </w:tc>
-      </w:tr>
-      <w:tr>
         <w:tc>
           <w:tcPr>
-            <w:tcW w:w="1212" w:type="pct"/>
+            <w:tcW w:w="3665" w:type="pct"/>
           </w:tcPr>
           <w:p>
             <w:pPr>
@@ -1733,13 +1079,18 @@
                 <w:color w:val="000000" w:themeColor="text1"/>
                 <w:sz w:val="20"/>
               </w:rPr>
-              <w:t>IDE</w:t>
+              <w:t>Pytest, Unittest, Testcontainers, SonarQube, Logging/Monitoring</w:t>
             </w:r>
           </w:p>
         </w:tc>
+      </w:tr>
+      <w:tr>
+        <w:trPr>
+          <w:trHeight w:val="378"/>
+        </w:trPr>
         <w:tc>
           <w:tcPr>
-            <w:tcW w:w="3788" w:type="pct"/>
+            <w:tcW w:w="1335" w:type="pct"/>
           </w:tcPr>
           <w:p>
             <w:pPr>
@@ -1758,23 +1109,13 @@
                 <w:color w:val="000000" w:themeColor="text1"/>
                 <w:sz w:val="20"/>
               </w:rPr>
-              <w:t xml:space="preserve">PyCharm, VS Code, </w:t>
-            </w:r>
-            <w:r>
-              <w:rPr>
-                <w:rFonts w:ascii="Arial Nova Cond" w:hAnsi="Arial Nova Cond"/>
-                <w:color w:val="000000" w:themeColor="text1"/>
-                <w:sz w:val="20"/>
-              </w:rPr>
-              <w:t>IntelliJ IDEA</w:t>
+              <w:t>Frontend (Secondary skills)</w:t>
             </w:r>
           </w:p>
         </w:tc>
-      </w:tr>
-      <w:tr>
         <w:tc>
           <w:tcPr>
-            <w:tcW w:w="1212" w:type="pct"/>
+            <w:tcW w:w="3665" w:type="pct"/>
           </w:tcPr>
           <w:p>
             <w:pPr>
@@ -1793,13 +1134,18 @@
                 <w:color w:val="000000" w:themeColor="text1"/>
                 <w:sz w:val="20"/>
               </w:rPr>
-              <w:t>Operating System</w:t>
+              <w:t>React.js, Next.js, Node.js, Express.js, Tailwind CSS, JavaScript (ES6+), Axios</w:t>
             </w:r>
           </w:p>
         </w:tc>
+      </w:tr>
+      <w:tr>
+        <w:trPr>
+          <w:trHeight w:val="378"/>
+        </w:trPr>
         <w:tc>
           <w:tcPr>
-            <w:tcW w:w="3788" w:type="pct"/>
+            <w:tcW w:w="1335" w:type="pct"/>
           </w:tcPr>
           <w:p>
             <w:pPr>
@@ -1818,7 +1164,32 @@
                 <w:color w:val="000000" w:themeColor="text1"/>
                 <w:sz w:val="20"/>
               </w:rPr>
-              <w:t>Window 11, Linux</w:t>
+              <w:t>IDE &amp; OS</w:t>
+            </w:r>
+          </w:p>
+        </w:tc>
+        <w:tc>
+          <w:tcPr>
+            <w:tcW w:w="3665" w:type="pct"/>
+          </w:tcPr>
+          <w:p>
+            <w:pPr>
+              <w:pStyle w:val="BodyText2"/>
+              <w:spacing w:after="0"/>
+              <w:jc w:val="left"/>
+              <w:rPr>
+                <w:rFonts w:ascii="Arial Nova Cond" w:hAnsi="Arial Nova Cond"/>
+                <w:color w:val="000000" w:themeColor="text1"/>
+                <w:sz w:val="20"/>
+              </w:rPr>
+            </w:pPr>
+            <w:r>
+              <w:rPr>
+                <w:rFonts w:ascii="Arial Nova Cond" w:hAnsi="Arial Nova Cond"/>
+                <w:color w:val="000000" w:themeColor="text1"/>
+                <w:sz w:val="20"/>
+              </w:rPr>
+              <w:t>PyCharm, VS Code, IntelliJ IDEA | Windows, Linux</w:t>
             </w:r>
           </w:p>
         </w:tc>
@@ -1880,7 +1251,6 @@
           <w:szCs w:val="20"/>
         </w:rPr>
       </w:pPr>
-      <w:proofErr w:type="gramStart"/>
       <w:r>
         <w:rPr>
           <w:rFonts w:ascii="Arial Nova Cond" w:hAnsi="Arial Nova Cond" w:cs="Calibri"/>
@@ -1915,17 +1285,7 @@
           <w:sz w:val="20"/>
           <w:szCs w:val="20"/>
         </w:rPr>
-        <w:t>.IT</w:t>
-      </w:r>
-      <w:proofErr w:type="gramEnd"/>
-      <w:r>
-        <w:rPr>
-          <w:rFonts w:ascii="Arial Nova Cond" w:hAnsi="Arial Nova Cond" w:cs="Calibri"/>
-          <w:color w:val="000000" w:themeColor="text1"/>
-          <w:sz w:val="20"/>
-          <w:szCs w:val="20"/>
-        </w:rPr>
-        <w:t xml:space="preserve"> </w:t>
+        <w:t xml:space="preserve">.IT </w:t>
       </w:r>
       <w:r>
         <w:rPr>
@@ -1943,27 +1303,7 @@
           <w:sz w:val="20"/>
           <w:szCs w:val="20"/>
         </w:rPr>
-        <w:t xml:space="preserve">Sree Narayana Guru College </w:t>
-      </w:r>
-      <w:proofErr w:type="gramStart"/>
-      <w:r>
-        <w:rPr>
-          <w:rFonts w:ascii="Arial Nova Cond" w:hAnsi="Arial Nova Cond" w:cs="Calibri"/>
-          <w:color w:val="000000" w:themeColor="text1"/>
-          <w:sz w:val="20"/>
-          <w:szCs w:val="20"/>
-        </w:rPr>
-        <w:t>Of</w:t>
-      </w:r>
-      <w:proofErr w:type="gramEnd"/>
-      <w:r>
-        <w:rPr>
-          <w:rFonts w:ascii="Arial Nova Cond" w:hAnsi="Arial Nova Cond" w:cs="Calibri"/>
-          <w:color w:val="000000" w:themeColor="text1"/>
-          <w:sz w:val="20"/>
-          <w:szCs w:val="20"/>
-        </w:rPr>
-        <w:t xml:space="preserve"> Commerce</w:t>
+        <w:t>Sree Narayana Guru College Of Commerce</w:t>
       </w:r>
       <w:r>
         <w:rPr>
@@ -1981,27 +1321,7 @@
           <w:sz w:val="20"/>
           <w:szCs w:val="20"/>
         </w:rPr>
-        <w:t xml:space="preserve"> University </w:t>
-      </w:r>
-      <w:proofErr w:type="gramStart"/>
-      <w:r>
-        <w:rPr>
-          <w:rFonts w:ascii="Arial Nova Cond" w:hAnsi="Arial Nova Cond" w:cs="Calibri"/>
-          <w:color w:val="000000" w:themeColor="text1"/>
-          <w:sz w:val="20"/>
-          <w:szCs w:val="20"/>
-        </w:rPr>
-        <w:t>Of</w:t>
-      </w:r>
-      <w:proofErr w:type="gramEnd"/>
-      <w:r>
-        <w:rPr>
-          <w:rFonts w:ascii="Arial Nova Cond" w:hAnsi="Arial Nova Cond" w:cs="Calibri"/>
-          <w:color w:val="000000" w:themeColor="text1"/>
-          <w:sz w:val="20"/>
-          <w:szCs w:val="20"/>
-        </w:rPr>
-        <w:t xml:space="preserve"> Mumbai</w:t>
+        <w:t xml:space="preserve"> University Of Mumbai</w:t>
       </w:r>
       <w:r>
         <w:rPr>
@@ -2058,25 +1378,14 @@
           <w:szCs w:val="20"/>
         </w:rPr>
       </w:pPr>
-      <w:proofErr w:type="spellStart"/>
-      <w:r>
-        <w:rPr>
-          <w:rFonts w:ascii="Arial Nova Cond" w:hAnsi="Arial Nova Cond" w:cs="Calibri"/>
-          <w:color w:val="000000" w:themeColor="text1"/>
-          <w:sz w:val="20"/>
-          <w:szCs w:val="20"/>
-        </w:rPr>
-        <w:t>XIIthStandard</w:t>
-      </w:r>
-      <w:proofErr w:type="spellEnd"/>
-      <w:r>
-        <w:rPr>
-          <w:rFonts w:ascii="Arial Nova Cond" w:hAnsi="Arial Nova Cond" w:cs="Calibri"/>
-          <w:color w:val="000000" w:themeColor="text1"/>
-          <w:sz w:val="20"/>
-          <w:szCs w:val="20"/>
-        </w:rPr>
-        <w:t xml:space="preserve"> from </w:t>
+      <w:r>
+        <w:rPr>
+          <w:rFonts w:ascii="Arial Nova Cond" w:hAnsi="Arial Nova Cond" w:cs="Calibri"/>
+          <w:color w:val="000000" w:themeColor="text1"/>
+          <w:sz w:val="20"/>
+          <w:szCs w:val="20"/>
+        </w:rPr>
+        <w:t xml:space="preserve">XIIthStandard from </w:t>
       </w:r>
       <w:r>
         <w:rPr>
@@ -2148,25 +1457,14 @@
           <w:szCs w:val="20"/>
         </w:rPr>
       </w:pPr>
-      <w:proofErr w:type="spellStart"/>
-      <w:r>
-        <w:rPr>
-          <w:rFonts w:ascii="Arial Nova Cond" w:hAnsi="Arial Nova Cond" w:cs="Calibri"/>
-          <w:color w:val="000000" w:themeColor="text1"/>
-          <w:sz w:val="20"/>
-          <w:szCs w:val="20"/>
-        </w:rPr>
-        <w:t>XthStandard</w:t>
-      </w:r>
-      <w:proofErr w:type="spellEnd"/>
-      <w:r>
-        <w:rPr>
-          <w:rFonts w:ascii="Arial Nova Cond" w:hAnsi="Arial Nova Cond" w:cs="Calibri"/>
-          <w:color w:val="000000" w:themeColor="text1"/>
-          <w:sz w:val="20"/>
-          <w:szCs w:val="20"/>
-        </w:rPr>
-        <w:t xml:space="preserve"> from S.R.P.N. High School, Board of Secondary </w:t>
+      <w:r>
+        <w:rPr>
+          <w:rFonts w:ascii="Arial Nova Cond" w:hAnsi="Arial Nova Cond" w:cs="Calibri"/>
+          <w:color w:val="000000" w:themeColor="text1"/>
+          <w:sz w:val="20"/>
+          <w:szCs w:val="20"/>
+        </w:rPr>
+        <w:t xml:space="preserve">XthStandard from S.R.P.N. High School, Board of Secondary </w:t>
       </w:r>
       <w:r>
         <w:rPr>
@@ -2184,39 +1482,19 @@
           <w:sz w:val="20"/>
           <w:szCs w:val="20"/>
         </w:rPr>
+        <w:t xml:space="preserve"> (</w:t>
+      </w:r>
+      <w:r>
         <w:t xml:space="preserve"> </w:t>
       </w:r>
-      <w:proofErr w:type="gramStart"/>
-      <w:r>
-        <w:rPr>
-          <w:rFonts w:ascii="Arial Nova Cond" w:hAnsi="Arial Nova Cond" w:cs="Calibri"/>
-          <w:color w:val="000000" w:themeColor="text1"/>
-          <w:sz w:val="20"/>
-          <w:szCs w:val="20"/>
-        </w:rPr>
-        <w:t>(</w:t>
-      </w:r>
-      <w:r>
-        <w:t xml:space="preserve"> </w:t>
-      </w:r>
-      <w:r>
-        <w:rPr>
-          <w:rFonts w:ascii="Arial Nova Cond" w:hAnsi="Arial Nova Cond" w:cs="Calibri"/>
-          <w:color w:val="000000" w:themeColor="text1"/>
-          <w:sz w:val="20"/>
-          <w:szCs w:val="20"/>
-        </w:rPr>
-        <w:t>2017</w:t>
-      </w:r>
-      <w:proofErr w:type="gramEnd"/>
-      <w:r>
-        <w:rPr>
-          <w:rFonts w:ascii="Arial Nova Cond" w:hAnsi="Arial Nova Cond" w:cs="Calibri"/>
-          <w:color w:val="000000" w:themeColor="text1"/>
-          <w:sz w:val="20"/>
-          <w:szCs w:val="20"/>
-        </w:rPr>
-        <w:t xml:space="preserve"> – 2018</w:t>
+      <w:r>
+        <w:rPr>
+          <w:rFonts w:ascii="Arial Nova Cond" w:hAnsi="Arial Nova Cond" w:cs="Calibri"/>
+          <w:color w:val="000000" w:themeColor="text1"/>
+          <w:sz w:val="20"/>
+          <w:szCs w:val="20"/>
+        </w:rPr>
+        <w:t>2017 – 2018</w:t>
       </w:r>
       <w:r>
         <w:rPr>
@@ -2273,7 +1551,7 @@
           <w:sz w:val="20"/>
           <w:szCs w:val="20"/>
         </w:rPr>
-        <w:t>Subscription Milestone</w:t>
+        <w:t>PrintSoft Replacement</w:t>
       </w:r>
       <w:r>
         <w:rPr>
@@ -2308,7 +1586,6 @@
         </w:rPr>
         <w:t xml:space="preserve">Client Name- </w:t>
       </w:r>
-      <w:proofErr w:type="spellStart"/>
       <w:r>
         <w:rPr>
           <w:rFonts w:ascii="Arial Nova Cond" w:hAnsi="Arial Nova Cond"/>
@@ -2318,9 +1595,8 @@
           <w:sz w:val="20"/>
           <w:szCs w:val="20"/>
         </w:rPr>
-        <w:t>Hcltech</w:t>
-      </w:r>
-      <w:proofErr w:type="spellEnd"/>
+        <w:t xml:space="preserve"> </w:t>
+      </w:r>
       <w:r>
         <w:rPr>
           <w:rFonts w:ascii="Arial Nova Cond" w:hAnsi="Arial Nova Cond"/>
@@ -2330,8 +1606,19 @@
           <w:sz w:val="20"/>
           <w:szCs w:val="20"/>
         </w:rPr>
-        <w:t xml:space="preserve"> (</w:t>
-      </w:r>
+        <w:t>AUS Logistics (Freelance)</w:t>
+      </w:r>
+    </w:p>
+    <w:p>
+      <w:pPr>
+        <w:spacing w:before="30" w:after="0"/>
+        <w:rPr>
+          <w:rFonts w:ascii="Arial Nova Cond" w:hAnsi="Arial Nova Cond"/>
+          <w:color w:val="000000" w:themeColor="text1"/>
+          <w:sz w:val="20"/>
+          <w:szCs w:val="20"/>
+        </w:rPr>
+      </w:pPr>
       <w:r>
         <w:rPr>
           <w:rFonts w:ascii="Arial Nova Cond" w:hAnsi="Arial Nova Cond"/>
@@ -2341,7 +1628,7 @@
           <w:sz w:val="20"/>
           <w:szCs w:val="20"/>
         </w:rPr>
-        <w:t>Freelance</w:t>
+        <w:t xml:space="preserve">Project Period - </w:t>
       </w:r>
       <w:r>
         <w:rPr>
@@ -2352,7 +1639,40 @@
           <w:sz w:val="20"/>
           <w:szCs w:val="20"/>
         </w:rPr>
-        <w:t>)</w:t>
+        <w:t>May</w:t>
+      </w:r>
+      <w:r>
+        <w:rPr>
+          <w:rFonts w:ascii="Arial Nova Cond" w:hAnsi="Arial Nova Cond"/>
+          <w:b/>
+          <w:smallCaps/>
+          <w:color w:val="000000" w:themeColor="text1"/>
+          <w:sz w:val="20"/>
+          <w:szCs w:val="20"/>
+        </w:rPr>
+        <w:t xml:space="preserve"> 202</w:t>
+      </w:r>
+      <w:r>
+        <w:rPr>
+          <w:rFonts w:ascii="Arial Nova Cond" w:hAnsi="Arial Nova Cond"/>
+          <w:b/>
+          <w:smallCaps/>
+          <w:color w:val="000000" w:themeColor="text1"/>
+          <w:sz w:val="20"/>
+          <w:szCs w:val="20"/>
+        </w:rPr>
+        <w:t>5</w:t>
+      </w:r>
+      <w:r>
+        <w:rPr>
+          <w:rFonts w:ascii="Arial Nova Cond" w:hAnsi="Arial Nova Cond"/>
+          <w:b/>
+          <w:smallCaps/>
+          <w:color w:val="000000" w:themeColor="text1"/>
+          <w:sz w:val="20"/>
+          <w:szCs w:val="20"/>
+        </w:rPr>
+        <w:t>- Till date</w:t>
       </w:r>
     </w:p>
     <w:p>
@@ -2374,7 +1694,7 @@
           <w:sz w:val="20"/>
           <w:szCs w:val="20"/>
         </w:rPr>
-        <w:t xml:space="preserve">Project Period - </w:t>
+        <w:t>Designation –</w:t>
       </w:r>
       <w:r>
         <w:rPr>
@@ -2385,9 +1705,38 @@
           <w:sz w:val="20"/>
           <w:szCs w:val="20"/>
         </w:rPr>
-        <w:t>May</w:t>
-      </w:r>
-      <w:r>
+        <w:t>Data engineer</w:t>
+      </w:r>
+    </w:p>
+    <w:p>
+      <w:pPr>
+        <w:spacing w:before="30" w:after="0"/>
+        <w:rPr>
+          <w:rFonts w:ascii="Arial Nova Cond" w:hAnsi="Arial Nova Cond"/>
+          <w:sz w:val="20"/>
+          <w:szCs w:val="20"/>
+        </w:rPr>
+      </w:pPr>
+      <w:r>
+        <w:rPr>
+          <w:rFonts w:ascii="Arial Nova Cond" w:hAnsi="Arial Nova Cond"/>
+          <w:sz w:val="20"/>
+          <w:szCs w:val="20"/>
+        </w:rPr>
+        <w:t>Migrated a legacy Printsoft document system to a serverless AWS architecture (Lambda, SQS, S3) integrated with Oracle ORDS APIs. Automated generation of invoices, bills, statements, and credit memos in PDF/CSV formats with conditional templates, reducing manual workload by 80% and ensuring audit-ready outputs</w:t>
+      </w:r>
+      <w:r>
+        <w:rPr>
+          <w:rFonts w:ascii="Arial Nova Cond" w:hAnsi="Arial Nova Cond"/>
+          <w:sz w:val="20"/>
+          <w:szCs w:val="20"/>
+        </w:rPr>
+        <w:t>.</w:t>
+      </w:r>
+    </w:p>
+    <w:p>
+      <w:pPr>
+        <w:spacing w:before="30" w:after="0"/>
         <w:rPr>
           <w:rFonts w:ascii="Arial Nova Cond" w:hAnsi="Arial Nova Cond"/>
           <w:b/>
@@ -2396,8 +1745,7 @@
           <w:sz w:val="20"/>
           <w:szCs w:val="20"/>
         </w:rPr>
-        <w:t xml:space="preserve"> 202</w:t>
-      </w:r>
+      </w:pPr>
       <w:r>
         <w:rPr>
           <w:rFonts w:ascii="Arial Nova Cond" w:hAnsi="Arial Nova Cond"/>
@@ -2407,128 +1755,40 @@
           <w:sz w:val="20"/>
           <w:szCs w:val="20"/>
         </w:rPr>
-        <w:t>5</w:t>
-      </w:r>
-      <w:r>
-        <w:rPr>
-          <w:rFonts w:ascii="Arial Nova Cond" w:hAnsi="Arial Nova Cond"/>
-          <w:b/>
-          <w:smallCaps/>
-          <w:color w:val="000000" w:themeColor="text1"/>
-          <w:sz w:val="20"/>
-          <w:szCs w:val="20"/>
-        </w:rPr>
-        <w:t>- Till date</w:t>
+        <w:lastRenderedPageBreak/>
+        <w:t>Roles and responsibilities</w:t>
       </w:r>
     </w:p>
     <w:p>
       <w:pPr>
-        <w:spacing w:before="30" w:after="0"/>
-        <w:rPr>
-          <w:rFonts w:ascii="Arial Nova Cond" w:hAnsi="Arial Nova Cond"/>
-          <w:color w:val="000000" w:themeColor="text1"/>
-          <w:sz w:val="20"/>
-          <w:szCs w:val="20"/>
-        </w:rPr>
-      </w:pPr>
-      <w:r>
-        <w:rPr>
-          <w:rFonts w:ascii="Arial Nova Cond" w:hAnsi="Arial Nova Cond"/>
-          <w:b/>
-          <w:smallCaps/>
-          <w:color w:val="000000" w:themeColor="text1"/>
-          <w:sz w:val="20"/>
-          <w:szCs w:val="20"/>
-        </w:rPr>
-        <w:t>Designation –Software Engineer</w:t>
-      </w:r>
-    </w:p>
-    <w:p>
-      <w:pPr>
-        <w:spacing w:before="30" w:after="0"/>
-        <w:rPr>
-          <w:rFonts w:ascii="Arial Nova Cond" w:hAnsi="Arial Nova Cond"/>
-          <w:sz w:val="20"/>
-          <w:szCs w:val="20"/>
-        </w:rPr>
-      </w:pPr>
-      <w:r>
-        <w:rPr>
-          <w:rFonts w:ascii="Arial Nova Cond" w:hAnsi="Arial Nova Cond"/>
-          <w:sz w:val="20"/>
-          <w:szCs w:val="20"/>
-        </w:rPr>
-        <w:t xml:space="preserve">Developed and maintained an AWS Glue streaming data pipeline using </w:t>
-      </w:r>
-      <w:proofErr w:type="spellStart"/>
-      <w:r>
-        <w:rPr>
-          <w:rFonts w:ascii="Arial Nova Cond" w:hAnsi="Arial Nova Cond"/>
-          <w:sz w:val="20"/>
-          <w:szCs w:val="20"/>
-        </w:rPr>
-        <w:t>PySpark</w:t>
-      </w:r>
-      <w:proofErr w:type="spellEnd"/>
-      <w:r>
-        <w:rPr>
-          <w:rFonts w:ascii="Arial Nova Cond" w:hAnsi="Arial Nova Cond"/>
-          <w:sz w:val="20"/>
-          <w:szCs w:val="20"/>
-        </w:rPr>
-        <w:t xml:space="preserve"> and Python to process, validate, and enrich consignment milestone events from Kinesis streams.</w:t>
-      </w:r>
-      <w:r>
-        <w:t xml:space="preserve"> </w:t>
-      </w:r>
-      <w:r>
-        <w:rPr>
-          <w:rFonts w:ascii="Arial Nova Cond" w:hAnsi="Arial Nova Cond"/>
-          <w:sz w:val="20"/>
-          <w:szCs w:val="20"/>
-        </w:rPr>
-        <w:t xml:space="preserve">Designed and deployed a real-time AWS Glue </w:t>
-      </w:r>
-      <w:r>
-        <w:rPr>
-          <w:rFonts w:ascii="Arial Nova Cond" w:hAnsi="Arial Nova Cond"/>
-          <w:sz w:val="20"/>
-          <w:szCs w:val="20"/>
-        </w:rPr>
-        <w:lastRenderedPageBreak/>
-        <w:t>streaming pipeline handling 1M+ milestone events per day, enriching Kinesis data with DynamoDB and RDS lookups, and automating 100% of operational metrics reporting to AWS CloudWatch</w:t>
-      </w:r>
-      <w:r>
-        <w:rPr>
-          <w:rFonts w:ascii="Arial Nova Cond" w:hAnsi="Arial Nova Cond"/>
-          <w:sz w:val="20"/>
-          <w:szCs w:val="20"/>
-        </w:rPr>
-        <w:t>.</w:t>
-      </w:r>
-    </w:p>
-    <w:p>
-      <w:pPr>
-        <w:spacing w:before="30" w:after="0"/>
-        <w:rPr>
-          <w:rFonts w:ascii="Arial Nova Cond" w:hAnsi="Arial Nova Cond"/>
-          <w:b/>
-          <w:smallCaps/>
-          <w:color w:val="000000" w:themeColor="text1"/>
-          <w:sz w:val="20"/>
-          <w:szCs w:val="20"/>
-        </w:rPr>
-      </w:pPr>
-      <w:r>
-        <w:rPr>
-          <w:rFonts w:ascii="Arial Nova Cond" w:hAnsi="Arial Nova Cond"/>
-          <w:b/>
-          <w:smallCaps/>
-          <w:color w:val="000000" w:themeColor="text1"/>
-          <w:sz w:val="20"/>
-          <w:szCs w:val="20"/>
-        </w:rPr>
-        <w:t>Roles and responsibilities</w:t>
+        <w:pStyle w:val="ListParagraph"/>
+        <w:numPr>
+          <w:ilvl w:val="0"/>
+          <w:numId w:val="35"/>
+        </w:numPr>
+        <w:spacing w:after="160" w:line="259" w:lineRule="auto"/>
+        <w:rPr>
+          <w:rFonts w:ascii="Arial Nova Cond" w:hAnsi="Arial Nova Cond"/>
+          <w:sz w:val="20"/>
+          <w:szCs w:val="20"/>
+        </w:rPr>
+      </w:pPr>
+      <w:r>
+        <w:rPr>
+          <w:rFonts w:ascii="Arial Nova Cond" w:hAnsi="Arial Nova Cond"/>
+          <w:sz w:val="20"/>
+          <w:szCs w:val="20"/>
+        </w:rPr>
+        <w:t>Automated enrichment of event data by querying DynamoDB and other AWS services</w:t>
+      </w:r>
+      <w:r>
+        <w:rPr>
+          <w:rFonts w:ascii="Arial Nova Cond" w:hAnsi="Arial Nova Cond" w:cs="Calibri"/>
+          <w:color w:val="000000" w:themeColor="text1"/>
+          <w:sz w:val="20"/>
+          <w:szCs w:val="20"/>
+        </w:rPr>
+        <w:t xml:space="preserve">. </w:t>
       </w:r>
     </w:p>
     <w:p>
@@ -2540,45 +1800,21 @@
         </w:numPr>
         <w:spacing w:after="0"/>
         <w:rPr>
-          <w:rFonts w:ascii="Arial Nova Cond" w:hAnsi="Arial Nova Cond" w:cs="Calibri"/>
-          <w:color w:val="000000" w:themeColor="text1"/>
-          <w:sz w:val="20"/>
-          <w:szCs w:val="20"/>
-        </w:rPr>
-      </w:pPr>
-      <w:r>
-        <w:rPr>
-          <w:rFonts w:ascii="Arial Nova Cond" w:hAnsi="Arial Nova Cond"/>
-          <w:sz w:val="20"/>
-          <w:szCs w:val="20"/>
-        </w:rPr>
-        <w:t xml:space="preserve">Built and optimized AWS Glue streaming jobs using </w:t>
-      </w:r>
-      <w:proofErr w:type="spellStart"/>
-      <w:r>
-        <w:rPr>
-          <w:rFonts w:ascii="Arial Nova Cond" w:hAnsi="Arial Nova Cond"/>
-          <w:sz w:val="20"/>
-          <w:szCs w:val="20"/>
-        </w:rPr>
-        <w:t>PySpark</w:t>
-      </w:r>
-      <w:proofErr w:type="spellEnd"/>
-      <w:r>
-        <w:rPr>
-          <w:rFonts w:ascii="Arial Nova Cond" w:hAnsi="Arial Nova Cond"/>
-          <w:sz w:val="20"/>
-          <w:szCs w:val="20"/>
-        </w:rPr>
-        <w:t>, reducing event processing time by 35% and improving data enrichment accuracy across 100K+ daily records</w:t>
-      </w:r>
-      <w:r>
-        <w:rPr>
-          <w:rFonts w:ascii="Arial Nova Cond" w:hAnsi="Arial Nova Cond"/>
-          <w:sz w:val="20"/>
-          <w:szCs w:val="20"/>
-        </w:rPr>
-        <w:t>.</w:t>
+          <w:rFonts w:ascii="Arial Nova Cond" w:hAnsi="Arial Nova Cond"/>
+          <w:b/>
+          <w:smallCaps/>
+          <w:color w:val="000000" w:themeColor="text1"/>
+          <w:sz w:val="20"/>
+          <w:szCs w:val="20"/>
+        </w:rPr>
+      </w:pPr>
+      <w:r>
+        <w:rPr>
+          <w:rFonts w:ascii="Arial Nova Cond" w:hAnsi="Arial Nova Cond"/>
+          <w:sz w:val="20"/>
+          <w:szCs w:val="20"/>
+        </w:rPr>
+        <w:t>Streamlined python project setup using Conda and Poetry.</w:t>
       </w:r>
     </w:p>
     <w:p>
@@ -2602,7 +1838,39 @@
           <w:sz w:val="20"/>
           <w:szCs w:val="20"/>
         </w:rPr>
-        <w:t>Integrated data ingestion from Kinesis streams and RDS using Spark JDBC connectors.</w:t>
+        <w:t>Migrated legacy Printsoft document system to a serverless AWS architecture</w:t>
+      </w:r>
+      <w:r>
+        <w:rPr>
+          <w:rFonts w:ascii="Arial Nova Cond" w:hAnsi="Arial Nova Cond"/>
+          <w:sz w:val="20"/>
+          <w:szCs w:val="20"/>
+        </w:rPr>
+        <w:t>.</w:t>
+      </w:r>
+    </w:p>
+    <w:p>
+      <w:pPr>
+        <w:pStyle w:val="ListParagraph"/>
+        <w:numPr>
+          <w:ilvl w:val="0"/>
+          <w:numId w:val="35"/>
+        </w:numPr>
+        <w:spacing w:after="0"/>
+        <w:rPr>
+          <w:rFonts w:ascii="Arial Nova Cond" w:hAnsi="Arial Nova Cond" w:cs="Calibri"/>
+          <w:color w:val="000000" w:themeColor="text1"/>
+          <w:sz w:val="20"/>
+          <w:szCs w:val="20"/>
+        </w:rPr>
+      </w:pPr>
+      <w:r>
+        <w:rPr>
+          <w:rFonts w:ascii="Arial Nova Cond" w:hAnsi="Arial Nova Cond"/>
+          <w:sz w:val="20"/>
+          <w:szCs w:val="20"/>
+        </w:rPr>
+        <w:t>Automated generation of invoices, bills, statements &amp; credit memos via Oracle ORDS APIs, Lambda, SQS, and stored outputs in S3.</w:t>
       </w:r>
     </w:p>
     <w:p>
@@ -2625,25 +1893,15 @@
           <w:sz w:val="20"/>
           <w:szCs w:val="20"/>
         </w:rPr>
-        <w:t xml:space="preserve">Implemented business logic for event validation, </w:t>
-      </w:r>
-      <w:proofErr w:type="gramStart"/>
-      <w:r>
-        <w:rPr>
-          <w:rFonts w:ascii="Arial Nova Cond" w:hAnsi="Arial Nova Cond"/>
-          <w:sz w:val="20"/>
-          <w:szCs w:val="20"/>
-        </w:rPr>
-        <w:t>enrichment</w:t>
-      </w:r>
-      <w:proofErr w:type="gramEnd"/>
-      <w:r>
-        <w:rPr>
-          <w:rFonts w:ascii="Arial Nova Cond" w:hAnsi="Arial Nova Cond"/>
-          <w:sz w:val="20"/>
-          <w:szCs w:val="20"/>
-        </w:rPr>
-        <w:t xml:space="preserve"> and transformation.</w:t>
+        <w:t>Designed naming conventions &amp; CSV/PDF templates (Direct Debit IF-ELSE, Reprint logic)</w:t>
+      </w:r>
+      <w:r>
+        <w:rPr>
+          <w:rFonts w:ascii="Arial Nova Cond" w:hAnsi="Arial Nova Cond"/>
+          <w:sz w:val="20"/>
+          <w:szCs w:val="20"/>
+        </w:rPr>
+        <w:t>.</w:t>
       </w:r>
     </w:p>
     <w:p>
@@ -2661,21 +1919,315 @@
         </w:rPr>
       </w:pPr>
       <w:r>
-        <w:rPr>
-          <w:rFonts w:ascii="Arial Nova Cond" w:hAnsi="Arial Nova Cond"/>
-          <w:sz w:val="20"/>
-          <w:szCs w:val="20"/>
-        </w:rPr>
-        <w:t>Automated enrichment of event data by querying DynamoDB and other AWS services</w:t>
-      </w:r>
-      <w:r>
-        <w:rPr>
-          <w:rFonts w:ascii="Arial Nova Cond" w:hAnsi="Arial Nova Cond" w:cs="Calibri"/>
-          <w:color w:val="000000" w:themeColor="text1"/>
-          <w:sz w:val="20"/>
-          <w:szCs w:val="20"/>
-        </w:rPr>
-        <w:t xml:space="preserve">. </w:t>
+        <w:t xml:space="preserve">Reduced manual effort by </w:t>
+      </w:r>
+      <w:r>
+        <w:rPr>
+          <w:rStyle w:val="Strong"/>
+        </w:rPr>
+        <w:t>80%</w:t>
+      </w:r>
+      <w:r>
+        <w:t xml:space="preserve"> and improved compliance with audit-friendly </w:t>
+      </w:r>
+      <w:r>
+        <w:rPr>
+          <w:rFonts w:ascii="Arial Nova Cond" w:hAnsi="Arial Nova Cond"/>
+          <w:sz w:val="20"/>
+          <w:szCs w:val="20"/>
+        </w:rPr>
+        <w:t>document</w:t>
+      </w:r>
+      <w:r>
+        <w:t xml:space="preserve"> storage.</w:t>
+      </w:r>
+    </w:p>
+    <w:p>
+      <w:pPr>
+        <w:spacing w:before="30" w:after="0"/>
+        <w:rPr>
+          <w:rFonts w:ascii="Arial Nova Cond" w:hAnsi="Arial Nova Cond"/>
+          <w:b/>
+          <w:smallCaps/>
+          <w:color w:val="000000" w:themeColor="text1"/>
+          <w:sz w:val="20"/>
+          <w:szCs w:val="20"/>
+        </w:rPr>
+      </w:pPr>
+      <w:r>
+        <w:rPr>
+          <w:rFonts w:ascii="Arial Nova Cond" w:hAnsi="Arial Nova Cond"/>
+          <w:b/>
+          <w:smallCaps/>
+          <w:color w:val="000000" w:themeColor="text1"/>
+          <w:sz w:val="20"/>
+          <w:szCs w:val="20"/>
+        </w:rPr>
+        <w:t>Project #</w:t>
+      </w:r>
+      <w:r>
+        <w:rPr>
+          <w:rFonts w:ascii="Arial Nova Cond" w:hAnsi="Arial Nova Cond"/>
+          <w:b/>
+          <w:smallCaps/>
+          <w:color w:val="000000" w:themeColor="text1"/>
+          <w:sz w:val="20"/>
+          <w:szCs w:val="20"/>
+        </w:rPr>
+        <w:t>2</w:t>
+      </w:r>
+      <w:r>
+        <w:rPr>
+          <w:rFonts w:ascii="Arial Nova Cond" w:hAnsi="Arial Nova Cond"/>
+          <w:b/>
+          <w:smallCaps/>
+          <w:color w:val="000000" w:themeColor="text1"/>
+          <w:sz w:val="20"/>
+          <w:szCs w:val="20"/>
+        </w:rPr>
+        <w:t xml:space="preserve"> – </w:t>
+      </w:r>
+      <w:r>
+        <w:rPr>
+          <w:rFonts w:ascii="Arial Nova Cond" w:hAnsi="Arial Nova Cond"/>
+          <w:b/>
+          <w:smallCaps/>
+          <w:color w:val="000000" w:themeColor="text1"/>
+          <w:sz w:val="20"/>
+          <w:szCs w:val="20"/>
+        </w:rPr>
+        <w:t>Prod Finance Data Pipeline</w:t>
+      </w:r>
+    </w:p>
+    <w:p>
+      <w:pPr>
+        <w:spacing w:before="30" w:after="0"/>
+        <w:rPr>
+          <w:rFonts w:ascii="Arial Nova Cond" w:hAnsi="Arial Nova Cond"/>
+          <w:color w:val="000000" w:themeColor="text1"/>
+          <w:sz w:val="20"/>
+          <w:szCs w:val="20"/>
+        </w:rPr>
+      </w:pPr>
+      <w:r>
+        <w:rPr>
+          <w:rFonts w:ascii="Arial Nova Cond" w:hAnsi="Arial Nova Cond"/>
+          <w:b/>
+          <w:smallCaps/>
+          <w:color w:val="000000" w:themeColor="text1"/>
+          <w:sz w:val="20"/>
+          <w:szCs w:val="20"/>
+        </w:rPr>
+        <w:t>Client Name- MOTOR</w:t>
+      </w:r>
+      <w:r>
+        <w:rPr>
+          <w:rFonts w:ascii="Arial Nova Cond" w:hAnsi="Arial Nova Cond"/>
+          <w:b/>
+          <w:smallCaps/>
+          <w:color w:val="000000" w:themeColor="text1"/>
+          <w:sz w:val="20"/>
+          <w:szCs w:val="20"/>
+        </w:rPr>
+        <w:t xml:space="preserve"> (</w:t>
+      </w:r>
+      <w:r>
+        <w:rPr>
+          <w:rFonts w:ascii="Arial Nova Cond" w:hAnsi="Arial Nova Cond"/>
+          <w:b/>
+          <w:smallCaps/>
+          <w:color w:val="000000" w:themeColor="text1"/>
+          <w:sz w:val="20"/>
+          <w:szCs w:val="20"/>
+        </w:rPr>
+        <w:t>Freelance</w:t>
+      </w:r>
+      <w:r>
+        <w:rPr>
+          <w:rFonts w:ascii="Arial Nova Cond" w:hAnsi="Arial Nova Cond"/>
+          <w:b/>
+          <w:smallCaps/>
+          <w:color w:val="000000" w:themeColor="text1"/>
+          <w:sz w:val="20"/>
+          <w:szCs w:val="20"/>
+        </w:rPr>
+        <w:t>)</w:t>
+      </w:r>
+    </w:p>
+    <w:p>
+      <w:pPr>
+        <w:spacing w:before="30" w:after="0"/>
+        <w:rPr>
+          <w:rFonts w:ascii="Arial Nova Cond" w:hAnsi="Arial Nova Cond"/>
+          <w:color w:val="000000" w:themeColor="text1"/>
+          <w:sz w:val="20"/>
+          <w:szCs w:val="20"/>
+        </w:rPr>
+      </w:pPr>
+      <w:r>
+        <w:rPr>
+          <w:rFonts w:ascii="Arial Nova Cond" w:hAnsi="Arial Nova Cond"/>
+          <w:b/>
+          <w:smallCaps/>
+          <w:color w:val="000000" w:themeColor="text1"/>
+          <w:sz w:val="20"/>
+          <w:szCs w:val="20"/>
+        </w:rPr>
+        <w:t xml:space="preserve">Project Period - </w:t>
+      </w:r>
+      <w:r>
+        <w:rPr>
+          <w:rFonts w:ascii="Arial Nova Cond" w:hAnsi="Arial Nova Cond"/>
+          <w:b/>
+          <w:smallCaps/>
+          <w:color w:val="000000" w:themeColor="text1"/>
+          <w:sz w:val="20"/>
+          <w:szCs w:val="20"/>
+        </w:rPr>
+        <w:t>Feb</w:t>
+      </w:r>
+      <w:r>
+        <w:rPr>
+          <w:rFonts w:ascii="Arial Nova Cond" w:hAnsi="Arial Nova Cond"/>
+          <w:b/>
+          <w:smallCaps/>
+          <w:color w:val="000000" w:themeColor="text1"/>
+          <w:sz w:val="20"/>
+          <w:szCs w:val="20"/>
+        </w:rPr>
+        <w:t xml:space="preserve"> 202</w:t>
+      </w:r>
+      <w:r>
+        <w:rPr>
+          <w:rFonts w:ascii="Arial Nova Cond" w:hAnsi="Arial Nova Cond"/>
+          <w:b/>
+          <w:smallCaps/>
+          <w:color w:val="000000" w:themeColor="text1"/>
+          <w:sz w:val="20"/>
+          <w:szCs w:val="20"/>
+        </w:rPr>
+        <w:t>5</w:t>
+      </w:r>
+      <w:r>
+        <w:rPr>
+          <w:rFonts w:ascii="Arial Nova Cond" w:hAnsi="Arial Nova Cond"/>
+          <w:b/>
+          <w:smallCaps/>
+          <w:color w:val="000000" w:themeColor="text1"/>
+          <w:sz w:val="20"/>
+          <w:szCs w:val="20"/>
+        </w:rPr>
+        <w:t xml:space="preserve">- </w:t>
+      </w:r>
+      <w:r>
+        <w:rPr>
+          <w:rFonts w:ascii="Arial Nova Cond" w:hAnsi="Arial Nova Cond"/>
+          <w:b/>
+          <w:smallCaps/>
+          <w:color w:val="000000" w:themeColor="text1"/>
+          <w:sz w:val="20"/>
+          <w:szCs w:val="20"/>
+        </w:rPr>
+        <w:t>May</w:t>
+      </w:r>
+      <w:r>
+        <w:rPr>
+          <w:rFonts w:ascii="Arial Nova Cond" w:hAnsi="Arial Nova Cond"/>
+          <w:b/>
+          <w:smallCaps/>
+          <w:color w:val="000000" w:themeColor="text1"/>
+          <w:sz w:val="20"/>
+          <w:szCs w:val="20"/>
+        </w:rPr>
+        <w:t xml:space="preserve"> </w:t>
+      </w:r>
+      <w:r>
+        <w:rPr>
+          <w:rFonts w:ascii="Arial Nova Cond" w:hAnsi="Arial Nova Cond"/>
+          <w:b/>
+          <w:smallCaps/>
+          <w:color w:val="000000" w:themeColor="text1"/>
+          <w:sz w:val="20"/>
+          <w:szCs w:val="20"/>
+        </w:rPr>
+        <w:t>2025</w:t>
+      </w:r>
+    </w:p>
+    <w:p>
+      <w:pPr>
+        <w:spacing w:before="30" w:after="0"/>
+        <w:rPr>
+          <w:rFonts w:ascii="Arial Nova Cond" w:hAnsi="Arial Nova Cond"/>
+          <w:color w:val="000000" w:themeColor="text1"/>
+          <w:sz w:val="20"/>
+          <w:szCs w:val="20"/>
+        </w:rPr>
+      </w:pPr>
+      <w:r>
+        <w:rPr>
+          <w:rFonts w:ascii="Arial Nova Cond" w:hAnsi="Arial Nova Cond"/>
+          <w:b/>
+          <w:smallCaps/>
+          <w:color w:val="000000" w:themeColor="text1"/>
+          <w:sz w:val="20"/>
+          <w:szCs w:val="20"/>
+        </w:rPr>
+        <w:t>Designation –</w:t>
+      </w:r>
+      <w:r>
+        <w:rPr>
+          <w:rFonts w:ascii="Arial Nova Cond" w:hAnsi="Arial Nova Cond"/>
+          <w:b/>
+          <w:smallCaps/>
+          <w:color w:val="000000" w:themeColor="text1"/>
+          <w:sz w:val="20"/>
+          <w:szCs w:val="20"/>
+        </w:rPr>
+        <w:t>Data Engineer</w:t>
+      </w:r>
+    </w:p>
+    <w:p>
+      <w:pPr>
+        <w:spacing w:before="30" w:after="0"/>
+        <w:rPr>
+          <w:rFonts w:ascii="Arial Nova Cond" w:hAnsi="Arial Nova Cond" w:cs="Calibri"/>
+          <w:color w:val="000000" w:themeColor="text1"/>
+          <w:sz w:val="20"/>
+          <w:szCs w:val="20"/>
+        </w:rPr>
+      </w:pPr>
+      <w:r>
+        <w:rPr>
+          <w:rFonts w:ascii="Arial Nova Cond" w:hAnsi="Arial Nova Cond" w:cs="Calibri"/>
+          <w:color w:val="000000" w:themeColor="text1"/>
+          <w:sz w:val="20"/>
+          <w:szCs w:val="20"/>
+        </w:rPr>
+        <w:t>Designed and deployed a finance data pipeline on AWS using Glue (PySpark), Step Functions, Lambda, and S3 to automate invoice, remittance, and credit memo processing. The system handled 30GB+ daily data, applied schema mapping, and integrated with DynamoDB/Redshift for enrichment, improving data reliability and reducing manual finance effort.</w:t>
+      </w:r>
+    </w:p>
+    <w:p>
+      <w:pPr>
+        <w:spacing w:before="30" w:after="0"/>
+        <w:rPr>
+          <w:rFonts w:ascii="Arial Nova Cond" w:hAnsi="Arial Nova Cond"/>
+          <w:b/>
+          <w:smallCaps/>
+          <w:color w:val="000000" w:themeColor="text1"/>
+          <w:sz w:val="20"/>
+          <w:szCs w:val="20"/>
+        </w:rPr>
+      </w:pPr>
+      <w:r>
+        <w:rPr>
+          <w:rFonts w:ascii="Arial Nova Cond" w:hAnsi="Arial Nova Cond"/>
+          <w:b/>
+          <w:smallCaps/>
+          <w:color w:val="000000" w:themeColor="text1"/>
+          <w:sz w:val="20"/>
+          <w:szCs w:val="20"/>
+        </w:rPr>
+        <w:t>Roles and responsibilities</w:t>
       </w:r>
     </w:p>
     <w:p>
@@ -2687,278 +2239,20 @@
         </w:numPr>
         <w:spacing w:after="0"/>
         <w:rPr>
-          <w:rFonts w:ascii="Arial Nova Cond" w:hAnsi="Arial Nova Cond"/>
-          <w:b/>
-          <w:smallCaps/>
-          <w:color w:val="000000" w:themeColor="text1"/>
-          <w:sz w:val="20"/>
-          <w:szCs w:val="20"/>
-        </w:rPr>
-      </w:pPr>
-      <w:r>
-        <w:rPr>
-          <w:rFonts w:ascii="Arial Nova Cond" w:hAnsi="Arial Nova Cond"/>
-          <w:sz w:val="20"/>
-          <w:szCs w:val="20"/>
-        </w:rPr>
-        <w:t>Streamlined python project setup using Conda and Poetry.</w:t>
-      </w:r>
-    </w:p>
-    <w:p>
-      <w:pPr>
-        <w:spacing w:before="30" w:after="0"/>
-        <w:rPr>
-          <w:rFonts w:ascii="Arial Nova Cond" w:hAnsi="Arial Nova Cond"/>
-          <w:b/>
-          <w:smallCaps/>
-          <w:color w:val="000000" w:themeColor="text1"/>
-          <w:sz w:val="18"/>
-          <w:szCs w:val="18"/>
-        </w:rPr>
-      </w:pPr>
-    </w:p>
-    <w:p>
-      <w:pPr>
-        <w:spacing w:before="30" w:after="0"/>
-        <w:rPr>
-          <w:rFonts w:ascii="Arial Nova Cond" w:hAnsi="Arial Nova Cond"/>
-          <w:b/>
-          <w:smallCaps/>
-          <w:color w:val="000000" w:themeColor="text1"/>
-          <w:sz w:val="20"/>
-          <w:szCs w:val="20"/>
-        </w:rPr>
-      </w:pPr>
-      <w:r>
-        <w:rPr>
-          <w:rFonts w:ascii="Arial Nova Cond" w:hAnsi="Arial Nova Cond"/>
-          <w:b/>
-          <w:smallCaps/>
-          <w:color w:val="000000" w:themeColor="text1"/>
-          <w:sz w:val="20"/>
-          <w:szCs w:val="20"/>
-        </w:rPr>
-        <w:t>Project #</w:t>
-      </w:r>
-      <w:r>
-        <w:rPr>
-          <w:rFonts w:ascii="Arial Nova Cond" w:hAnsi="Arial Nova Cond"/>
-          <w:b/>
-          <w:smallCaps/>
-          <w:color w:val="000000" w:themeColor="text1"/>
-          <w:sz w:val="20"/>
-          <w:szCs w:val="20"/>
-        </w:rPr>
-        <w:t>2</w:t>
-      </w:r>
-      <w:r>
-        <w:rPr>
-          <w:rFonts w:ascii="Arial Nova Cond" w:hAnsi="Arial Nova Cond"/>
-          <w:b/>
-          <w:smallCaps/>
-          <w:color w:val="000000" w:themeColor="text1"/>
-          <w:sz w:val="20"/>
-          <w:szCs w:val="20"/>
-        </w:rPr>
-        <w:t xml:space="preserve"> – Insights Content</w:t>
-      </w:r>
-    </w:p>
-    <w:p>
-      <w:pPr>
-        <w:spacing w:before="30" w:after="0"/>
-        <w:rPr>
-          <w:rFonts w:ascii="Arial Nova Cond" w:hAnsi="Arial Nova Cond"/>
-          <w:color w:val="000000" w:themeColor="text1"/>
-          <w:sz w:val="20"/>
-          <w:szCs w:val="20"/>
-        </w:rPr>
-      </w:pPr>
-      <w:r>
-        <w:rPr>
-          <w:rFonts w:ascii="Arial Nova Cond" w:hAnsi="Arial Nova Cond"/>
-          <w:b/>
-          <w:smallCaps/>
-          <w:color w:val="000000" w:themeColor="text1"/>
-          <w:sz w:val="20"/>
-          <w:szCs w:val="20"/>
-        </w:rPr>
-        <w:t>Client Name- MOTOR</w:t>
-      </w:r>
-      <w:r>
-        <w:rPr>
-          <w:rFonts w:ascii="Arial Nova Cond" w:hAnsi="Arial Nova Cond"/>
-          <w:b/>
-          <w:smallCaps/>
-          <w:color w:val="000000" w:themeColor="text1"/>
-          <w:sz w:val="20"/>
-          <w:szCs w:val="20"/>
-        </w:rPr>
-        <w:t xml:space="preserve"> (</w:t>
-      </w:r>
-      <w:r>
-        <w:rPr>
-          <w:rFonts w:ascii="Arial Nova Cond" w:hAnsi="Arial Nova Cond"/>
-          <w:b/>
-          <w:smallCaps/>
-          <w:color w:val="000000" w:themeColor="text1"/>
-          <w:sz w:val="20"/>
-          <w:szCs w:val="20"/>
-        </w:rPr>
-        <w:t>Freelance</w:t>
-      </w:r>
-      <w:r>
-        <w:rPr>
-          <w:rFonts w:ascii="Arial Nova Cond" w:hAnsi="Arial Nova Cond"/>
-          <w:b/>
-          <w:smallCaps/>
-          <w:color w:val="000000" w:themeColor="text1"/>
-          <w:sz w:val="20"/>
-          <w:szCs w:val="20"/>
-        </w:rPr>
-        <w:t>)</w:t>
-      </w:r>
-    </w:p>
-    <w:p>
-      <w:pPr>
-        <w:spacing w:before="30" w:after="0"/>
-        <w:rPr>
-          <w:rFonts w:ascii="Arial Nova Cond" w:hAnsi="Arial Nova Cond"/>
-          <w:color w:val="000000" w:themeColor="text1"/>
-          <w:sz w:val="20"/>
-          <w:szCs w:val="20"/>
-        </w:rPr>
-      </w:pPr>
-      <w:r>
-        <w:rPr>
-          <w:rFonts w:ascii="Arial Nova Cond" w:hAnsi="Arial Nova Cond"/>
-          <w:b/>
-          <w:smallCaps/>
-          <w:color w:val="000000" w:themeColor="text1"/>
-          <w:sz w:val="20"/>
-          <w:szCs w:val="20"/>
-        </w:rPr>
-        <w:t xml:space="preserve">Project Period - </w:t>
-      </w:r>
-      <w:r>
-        <w:rPr>
-          <w:rFonts w:ascii="Arial Nova Cond" w:hAnsi="Arial Nova Cond"/>
-          <w:b/>
-          <w:smallCaps/>
-          <w:color w:val="000000" w:themeColor="text1"/>
-          <w:sz w:val="20"/>
-          <w:szCs w:val="20"/>
-        </w:rPr>
-        <w:t>Feb</w:t>
-      </w:r>
-      <w:r>
-        <w:rPr>
-          <w:rFonts w:ascii="Arial Nova Cond" w:hAnsi="Arial Nova Cond"/>
-          <w:b/>
-          <w:smallCaps/>
-          <w:color w:val="000000" w:themeColor="text1"/>
-          <w:sz w:val="20"/>
-          <w:szCs w:val="20"/>
-        </w:rPr>
-        <w:t xml:space="preserve"> 202</w:t>
-      </w:r>
-      <w:r>
-        <w:rPr>
-          <w:rFonts w:ascii="Arial Nova Cond" w:hAnsi="Arial Nova Cond"/>
-          <w:b/>
-          <w:smallCaps/>
-          <w:color w:val="000000" w:themeColor="text1"/>
-          <w:sz w:val="20"/>
-          <w:szCs w:val="20"/>
-        </w:rPr>
-        <w:t>5</w:t>
-      </w:r>
-      <w:r>
-        <w:rPr>
-          <w:rFonts w:ascii="Arial Nova Cond" w:hAnsi="Arial Nova Cond"/>
-          <w:b/>
-          <w:smallCaps/>
-          <w:color w:val="000000" w:themeColor="text1"/>
-          <w:sz w:val="20"/>
-          <w:szCs w:val="20"/>
-        </w:rPr>
-        <w:t>- Till date</w:t>
-      </w:r>
-    </w:p>
-    <w:p>
-      <w:pPr>
-        <w:spacing w:before="30" w:after="0"/>
-        <w:rPr>
-          <w:rFonts w:ascii="Arial Nova Cond" w:hAnsi="Arial Nova Cond"/>
-          <w:color w:val="000000" w:themeColor="text1"/>
-          <w:sz w:val="20"/>
-          <w:szCs w:val="20"/>
-        </w:rPr>
-      </w:pPr>
-      <w:r>
-        <w:rPr>
-          <w:rFonts w:ascii="Arial Nova Cond" w:hAnsi="Arial Nova Cond"/>
-          <w:b/>
-          <w:smallCaps/>
-          <w:color w:val="000000" w:themeColor="text1"/>
-          <w:sz w:val="20"/>
-          <w:szCs w:val="20"/>
-        </w:rPr>
-        <w:t>Designation –</w:t>
-      </w:r>
-      <w:r>
-        <w:rPr>
-          <w:rFonts w:ascii="Arial Nova Cond" w:hAnsi="Arial Nova Cond"/>
-          <w:b/>
-          <w:smallCaps/>
-          <w:color w:val="000000" w:themeColor="text1"/>
-          <w:sz w:val="20"/>
-          <w:szCs w:val="20"/>
-        </w:rPr>
-        <w:t>Data Engineer</w:t>
-      </w:r>
-    </w:p>
-    <w:p>
-      <w:pPr>
-        <w:spacing w:before="30" w:after="0"/>
-        <w:rPr>
-          <w:rFonts w:ascii="Arial Nova Cond" w:hAnsi="Arial Nova Cond" w:cs="Calibri"/>
-          <w:color w:val="000000" w:themeColor="text1"/>
-          <w:sz w:val="20"/>
-          <w:szCs w:val="20"/>
-        </w:rPr>
-      </w:pPr>
-      <w:r>
-        <w:rPr>
-          <w:rFonts w:ascii="Arial Nova Cond" w:hAnsi="Arial Nova Cond" w:cs="Calibri"/>
-          <w:color w:val="000000" w:themeColor="text1"/>
-          <w:sz w:val="20"/>
-          <w:szCs w:val="20"/>
-        </w:rPr>
-        <w:t>This project involves the aggregation and analysis of automotive data, specifically focusing on MOTOR repair data collected from various suppliers and manufacturers. The goal is to generate valuable insights into repair trends, component reliability, and supplier performance, which can be used to improve product quality and optimize repair processes.</w:t>
-      </w:r>
-    </w:p>
-    <w:p>
-      <w:pPr>
-        <w:spacing w:before="30" w:after="0"/>
-        <w:rPr>
-          <w:rFonts w:ascii="Arial Nova Cond" w:hAnsi="Arial Nova Cond"/>
-          <w:b/>
-          <w:smallCaps/>
-          <w:color w:val="000000" w:themeColor="text1"/>
-          <w:sz w:val="20"/>
-          <w:szCs w:val="20"/>
-        </w:rPr>
-      </w:pPr>
-      <w:r>
-        <w:rPr>
-          <w:rFonts w:ascii="Arial Nova Cond" w:hAnsi="Arial Nova Cond"/>
-          <w:b/>
-          <w:smallCaps/>
-          <w:color w:val="000000" w:themeColor="text1"/>
-          <w:sz w:val="20"/>
-          <w:szCs w:val="20"/>
-        </w:rPr>
-        <w:t>Roles and responsibilities</w:t>
+          <w:rFonts w:ascii="Arial Nova Cond" w:hAnsi="Arial Nova Cond" w:cs="Calibri"/>
+          <w:color w:val="000000" w:themeColor="text1"/>
+          <w:sz w:val="20"/>
+          <w:szCs w:val="20"/>
+        </w:rPr>
+      </w:pPr>
+      <w:r>
+        <w:rPr>
+          <w:rFonts w:ascii="Arial Nova Cond" w:hAnsi="Arial Nova Cond" w:cs="Calibri"/>
+          <w:color w:val="000000" w:themeColor="text1"/>
+          <w:sz w:val="20"/>
+          <w:szCs w:val="20"/>
+        </w:rPr>
+        <w:t>Clean, pre-process, and transform large datasets to create high-quality training data for machine learning models.</w:t>
       </w:r>
     </w:p>
     <w:p>
@@ -2983,7 +2277,7 @@
           <w:sz w:val="20"/>
           <w:szCs w:val="20"/>
         </w:rPr>
-        <w:t>Clean, pre-process, and transform large datasets to create high-quality training data for machine learning models.</w:t>
+        <w:t>Skilled in Python and popular machine learning libraries NumPy, Pandas and Scikit-learn.</w:t>
       </w:r>
     </w:p>
     <w:p>
@@ -3008,7 +2302,16 @@
           <w:sz w:val="20"/>
           <w:szCs w:val="20"/>
         </w:rPr>
-        <w:t>Skilled in Python and popular machine learning libraries NumPy, Pandas and Scikit-learn.</w:t>
+        <w:t>Development of glue pyspark scripts.</w:t>
+      </w:r>
+      <w:r>
+        <w:rPr>
+          <w:rFonts w:ascii="Arial Nova Cond" w:hAnsi="Arial Nova Cond" w:cs="Calibri"/>
+          <w:color w:val="000000" w:themeColor="text1"/>
+          <w:sz w:val="20"/>
+          <w:szCs w:val="20"/>
+        </w:rPr>
+        <w:t xml:space="preserve"> </w:t>
       </w:r>
     </w:p>
     <w:p>
@@ -3033,36 +2336,7 @@
           <w:sz w:val="20"/>
           <w:szCs w:val="20"/>
         </w:rPr>
-        <w:t xml:space="preserve">Development of glue </w:t>
-      </w:r>
-      <w:proofErr w:type="spellStart"/>
-      <w:r>
-        <w:rPr>
-          <w:rFonts w:ascii="Arial Nova Cond" w:hAnsi="Arial Nova Cond" w:cs="Calibri"/>
-          <w:color w:val="000000" w:themeColor="text1"/>
-          <w:sz w:val="20"/>
-          <w:szCs w:val="20"/>
-        </w:rPr>
-        <w:t>pyspark</w:t>
-      </w:r>
-      <w:proofErr w:type="spellEnd"/>
-      <w:r>
-        <w:rPr>
-          <w:rFonts w:ascii="Arial Nova Cond" w:hAnsi="Arial Nova Cond" w:cs="Calibri"/>
-          <w:color w:val="000000" w:themeColor="text1"/>
-          <w:sz w:val="20"/>
-          <w:szCs w:val="20"/>
-        </w:rPr>
-        <w:t xml:space="preserve"> scripts.</w:t>
-      </w:r>
-      <w:r>
-        <w:rPr>
-          <w:rFonts w:ascii="Arial Nova Cond" w:hAnsi="Arial Nova Cond" w:cs="Calibri"/>
-          <w:color w:val="000000" w:themeColor="text1"/>
-          <w:sz w:val="20"/>
-          <w:szCs w:val="20"/>
-        </w:rPr>
-        <w:t xml:space="preserve"> </w:t>
+        <w:t>Designed &amp; implemented AWS Glue (PySpark) ETL pipeline to automate invoice, remittance, and credit memo processing (~30GB+ data).</w:t>
       </w:r>
     </w:p>
     <w:p>
@@ -3087,7 +2361,7 @@
           <w:sz w:val="20"/>
           <w:szCs w:val="20"/>
         </w:rPr>
-        <w:t>Experience working with very large datasets.</w:t>
+        <w:t>Orchestrated multi-step workflows using Step Functions + Lambda (ECR-based) with S3 as data lake.</w:t>
       </w:r>
     </w:p>
     <w:p>
@@ -3112,7 +2386,7 @@
           <w:sz w:val="20"/>
           <w:szCs w:val="20"/>
         </w:rPr>
-        <w:t>Expertise and Efficient code writing in Python.</w:t>
+        <w:t>Implemented schema mapping, incremental loads, and bookmarks to optimize large-scale data ingestion.</w:t>
       </w:r>
     </w:p>
     <w:p>
@@ -3137,7 +2411,372 @@
           <w:sz w:val="20"/>
           <w:szCs w:val="20"/>
         </w:rPr>
-        <w:t>Secured and protected endpoints using AWS Cognito.</w:t>
+        <w:t>Built monitoring (CloudWatch, SES alerts, Teams notifications) and error handling, reducing downtime by 40%.</w:t>
+      </w:r>
+    </w:p>
+    <w:p>
+      <w:pPr>
+        <w:spacing w:before="30" w:after="0"/>
+        <w:rPr>
+          <w:rFonts w:ascii="Arial Nova Cond" w:hAnsi="Arial Nova Cond"/>
+          <w:b/>
+          <w:smallCaps/>
+          <w:color w:val="000000" w:themeColor="text1"/>
+          <w:sz w:val="20"/>
+          <w:szCs w:val="20"/>
+        </w:rPr>
+      </w:pPr>
+    </w:p>
+    <w:p>
+      <w:pPr>
+        <w:spacing w:before="30" w:after="0"/>
+        <w:rPr>
+          <w:rFonts w:ascii="Arial Nova Cond" w:hAnsi="Arial Nova Cond"/>
+          <w:b/>
+          <w:smallCaps/>
+          <w:color w:val="000000" w:themeColor="text1"/>
+          <w:sz w:val="20"/>
+          <w:szCs w:val="20"/>
+        </w:rPr>
+      </w:pPr>
+      <w:r>
+        <w:rPr>
+          <w:rFonts w:ascii="Arial Nova Cond" w:hAnsi="Arial Nova Cond"/>
+          <w:b/>
+          <w:smallCaps/>
+          <w:color w:val="000000" w:themeColor="text1"/>
+          <w:sz w:val="20"/>
+          <w:szCs w:val="20"/>
+        </w:rPr>
+        <w:t>Project #</w:t>
+      </w:r>
+      <w:r>
+        <w:rPr>
+          <w:rFonts w:ascii="Arial Nova Cond" w:hAnsi="Arial Nova Cond"/>
+          <w:b/>
+          <w:smallCaps/>
+          <w:color w:val="000000" w:themeColor="text1"/>
+          <w:sz w:val="20"/>
+          <w:szCs w:val="20"/>
+        </w:rPr>
+        <w:t>3</w:t>
+      </w:r>
+      <w:r>
+        <w:rPr>
+          <w:rFonts w:ascii="Arial Nova Cond" w:hAnsi="Arial Nova Cond"/>
+          <w:b/>
+          <w:smallCaps/>
+          <w:color w:val="000000" w:themeColor="text1"/>
+          <w:sz w:val="20"/>
+          <w:szCs w:val="20"/>
+        </w:rPr>
+        <w:t xml:space="preserve"> – </w:t>
+      </w:r>
+      <w:r>
+        <w:rPr>
+          <w:rFonts w:ascii="Arial Nova Cond" w:hAnsi="Arial Nova Cond"/>
+          <w:b/>
+          <w:smallCaps/>
+          <w:color w:val="000000" w:themeColor="text1"/>
+          <w:sz w:val="20"/>
+          <w:szCs w:val="20"/>
+        </w:rPr>
+        <w:t>JazzTrack Management System</w:t>
+      </w:r>
+    </w:p>
+    <w:p>
+      <w:pPr>
+        <w:spacing w:before="30" w:after="0"/>
+        <w:rPr>
+          <w:rFonts w:ascii="Arial Nova Cond" w:hAnsi="Arial Nova Cond"/>
+          <w:color w:val="000000" w:themeColor="text1"/>
+          <w:sz w:val="20"/>
+          <w:szCs w:val="20"/>
+        </w:rPr>
+      </w:pPr>
+      <w:r>
+        <w:rPr>
+          <w:rFonts w:ascii="Arial Nova Cond" w:hAnsi="Arial Nova Cond"/>
+          <w:b/>
+          <w:smallCaps/>
+          <w:color w:val="000000" w:themeColor="text1"/>
+          <w:sz w:val="20"/>
+          <w:szCs w:val="20"/>
+        </w:rPr>
+        <w:t xml:space="preserve">Company Name </w:t>
+      </w:r>
+      <w:r>
+        <w:rPr>
+          <w:rFonts w:ascii="Arial Nova Cond" w:hAnsi="Arial Nova Cond"/>
+          <w:b/>
+          <w:smallCaps/>
+          <w:color w:val="000000" w:themeColor="text1"/>
+          <w:sz w:val="20"/>
+          <w:szCs w:val="20"/>
+        </w:rPr>
+        <w:t>–</w:t>
+      </w:r>
+      <w:r>
+        <w:rPr>
+          <w:rFonts w:ascii="Arial Nova Cond" w:hAnsi="Arial Nova Cond"/>
+          <w:b/>
+          <w:smallCaps/>
+          <w:color w:val="000000" w:themeColor="text1"/>
+          <w:sz w:val="20"/>
+          <w:szCs w:val="20"/>
+        </w:rPr>
+        <w:t xml:space="preserve"> </w:t>
+      </w:r>
+      <w:r>
+        <w:rPr>
+          <w:rFonts w:ascii="Arial Nova Cond" w:hAnsi="Arial Nova Cond"/>
+          <w:b/>
+          <w:smallCaps/>
+          <w:color w:val="000000" w:themeColor="text1"/>
+          <w:sz w:val="20"/>
+          <w:szCs w:val="20"/>
+        </w:rPr>
+        <w:t>33 Kuber India Advisory Lpp</w:t>
+      </w:r>
+      <w:r>
+        <w:rPr>
+          <w:rFonts w:ascii="Arial Nova Cond" w:hAnsi="Arial Nova Cond"/>
+          <w:b/>
+          <w:smallCaps/>
+          <w:color w:val="000000" w:themeColor="text1"/>
+          <w:sz w:val="20"/>
+          <w:szCs w:val="20"/>
+        </w:rPr>
+        <w:t>.</w:t>
+      </w:r>
+    </w:p>
+    <w:p>
+      <w:pPr>
+        <w:spacing w:before="30" w:after="0"/>
+        <w:rPr>
+          <w:rFonts w:ascii="Arial Nova Cond" w:hAnsi="Arial Nova Cond"/>
+          <w:color w:val="000000" w:themeColor="text1"/>
+          <w:sz w:val="20"/>
+          <w:szCs w:val="20"/>
+        </w:rPr>
+      </w:pPr>
+      <w:r>
+        <w:rPr>
+          <w:rFonts w:ascii="Arial Nova Cond" w:hAnsi="Arial Nova Cond"/>
+          <w:b/>
+          <w:smallCaps/>
+          <w:color w:val="000000" w:themeColor="text1"/>
+          <w:sz w:val="20"/>
+          <w:szCs w:val="20"/>
+        </w:rPr>
+        <w:t xml:space="preserve">Project Period - </w:t>
+      </w:r>
+      <w:r>
+        <w:rPr>
+          <w:rFonts w:ascii="Arial Nova Cond" w:hAnsi="Arial Nova Cond"/>
+          <w:b/>
+          <w:smallCaps/>
+          <w:color w:val="000000" w:themeColor="text1"/>
+          <w:sz w:val="20"/>
+          <w:szCs w:val="20"/>
+        </w:rPr>
+        <w:t>Sep</w:t>
+      </w:r>
+      <w:r>
+        <w:rPr>
+          <w:rFonts w:ascii="Arial Nova Cond" w:hAnsi="Arial Nova Cond"/>
+          <w:b/>
+          <w:smallCaps/>
+          <w:color w:val="000000" w:themeColor="text1"/>
+          <w:sz w:val="20"/>
+          <w:szCs w:val="20"/>
+        </w:rPr>
+        <w:t xml:space="preserve"> 202</w:t>
+      </w:r>
+      <w:r>
+        <w:rPr>
+          <w:rFonts w:ascii="Arial Nova Cond" w:hAnsi="Arial Nova Cond"/>
+          <w:b/>
+          <w:smallCaps/>
+          <w:color w:val="000000" w:themeColor="text1"/>
+          <w:sz w:val="20"/>
+          <w:szCs w:val="20"/>
+        </w:rPr>
+        <w:t>3</w:t>
+      </w:r>
+      <w:r>
+        <w:rPr>
+          <w:rFonts w:ascii="Arial Nova Cond" w:hAnsi="Arial Nova Cond"/>
+          <w:b/>
+          <w:smallCaps/>
+          <w:color w:val="000000" w:themeColor="text1"/>
+          <w:sz w:val="20"/>
+          <w:szCs w:val="20"/>
+        </w:rPr>
+        <w:t xml:space="preserve"> </w:t>
+      </w:r>
+      <w:r>
+        <w:rPr>
+          <w:rFonts w:ascii="Arial Nova Cond" w:hAnsi="Arial Nova Cond"/>
+          <w:b/>
+          <w:smallCaps/>
+          <w:color w:val="000000" w:themeColor="text1"/>
+          <w:sz w:val="20"/>
+          <w:szCs w:val="20"/>
+        </w:rPr>
+        <w:t>–</w:t>
+      </w:r>
+      <w:r>
+        <w:rPr>
+          <w:rFonts w:ascii="Arial Nova Cond" w:hAnsi="Arial Nova Cond"/>
+          <w:b/>
+          <w:smallCaps/>
+          <w:color w:val="000000" w:themeColor="text1"/>
+          <w:sz w:val="20"/>
+          <w:szCs w:val="20"/>
+        </w:rPr>
+        <w:t xml:space="preserve"> </w:t>
+      </w:r>
+      <w:r>
+        <w:rPr>
+          <w:rFonts w:ascii="Arial Nova Cond" w:hAnsi="Arial Nova Cond"/>
+          <w:b/>
+          <w:smallCaps/>
+          <w:color w:val="000000" w:themeColor="text1"/>
+          <w:sz w:val="20"/>
+          <w:szCs w:val="20"/>
+        </w:rPr>
+        <w:t>Jan</w:t>
+      </w:r>
+      <w:r>
+        <w:rPr>
+          <w:rFonts w:ascii="Arial Nova Cond" w:hAnsi="Arial Nova Cond"/>
+          <w:b/>
+          <w:smallCaps/>
+          <w:color w:val="000000" w:themeColor="text1"/>
+          <w:sz w:val="20"/>
+          <w:szCs w:val="20"/>
+        </w:rPr>
+        <w:t xml:space="preserve"> 202</w:t>
+      </w:r>
+      <w:r>
+        <w:rPr>
+          <w:rFonts w:ascii="Arial Nova Cond" w:hAnsi="Arial Nova Cond"/>
+          <w:b/>
+          <w:smallCaps/>
+          <w:color w:val="000000" w:themeColor="text1"/>
+          <w:sz w:val="20"/>
+          <w:szCs w:val="20"/>
+        </w:rPr>
+        <w:t>5</w:t>
+      </w:r>
+    </w:p>
+    <w:p>
+      <w:pPr>
+        <w:spacing w:before="30" w:after="0"/>
+        <w:rPr>
+          <w:rFonts w:ascii="Arial Nova Cond" w:hAnsi="Arial Nova Cond"/>
+          <w:color w:val="000000" w:themeColor="text1"/>
+          <w:sz w:val="20"/>
+          <w:szCs w:val="20"/>
+        </w:rPr>
+      </w:pPr>
+      <w:r>
+        <w:rPr>
+          <w:rFonts w:ascii="Arial Nova Cond" w:hAnsi="Arial Nova Cond"/>
+          <w:b/>
+          <w:smallCaps/>
+          <w:color w:val="000000" w:themeColor="text1"/>
+          <w:sz w:val="20"/>
+          <w:szCs w:val="20"/>
+        </w:rPr>
+        <w:t xml:space="preserve">Designation </w:t>
+      </w:r>
+      <w:r>
+        <w:rPr>
+          <w:rFonts w:ascii="Arial Nova Cond" w:hAnsi="Arial Nova Cond"/>
+          <w:b/>
+          <w:smallCaps/>
+          <w:color w:val="000000" w:themeColor="text1"/>
+          <w:sz w:val="20"/>
+          <w:szCs w:val="20"/>
+        </w:rPr>
+        <w:t>–</w:t>
+      </w:r>
+      <w:r>
+        <w:rPr>
+          <w:rFonts w:ascii="Arial Nova Cond" w:hAnsi="Arial Nova Cond"/>
+          <w:b/>
+          <w:smallCaps/>
+          <w:color w:val="000000" w:themeColor="text1"/>
+          <w:sz w:val="20"/>
+          <w:szCs w:val="20"/>
+        </w:rPr>
+        <w:t xml:space="preserve">Software </w:t>
+      </w:r>
+      <w:r>
+        <w:rPr>
+          <w:rFonts w:ascii="Arial Nova Cond" w:hAnsi="Arial Nova Cond"/>
+          <w:b/>
+          <w:smallCaps/>
+          <w:color w:val="000000" w:themeColor="text1"/>
+          <w:sz w:val="20"/>
+          <w:szCs w:val="20"/>
+        </w:rPr>
+        <w:t>Developer</w:t>
+      </w:r>
+    </w:p>
+    <w:p>
+      <w:pPr>
+        <w:spacing w:before="30" w:after="0"/>
+        <w:rPr>
+          <w:rFonts w:ascii="Arial Nova Cond" w:hAnsi="Arial Nova Cond" w:cs="Calibri"/>
+          <w:color w:val="000000" w:themeColor="text1"/>
+          <w:sz w:val="20"/>
+          <w:szCs w:val="20"/>
+        </w:rPr>
+      </w:pPr>
+      <w:r>
+        <w:rPr>
+          <w:rFonts w:ascii="Arial Nova Cond" w:hAnsi="Arial Nova Cond" w:cs="Calibri"/>
+          <w:color w:val="000000" w:themeColor="text1"/>
+          <w:sz w:val="20"/>
+          <w:szCs w:val="20"/>
+        </w:rPr>
+        <w:t>Designed and delivered robust full-stack web applications using React, Tailwind CSS, and MySQL, with seamless integration of CRM/CRS/SRC systems, efficient RESTful APIs, advanced database tuning using stored procedures and views, and automated testing frameworks that significantly enhanced software stability and reduced bugs</w:t>
+      </w:r>
+      <w:r>
+        <w:rPr>
+          <w:rFonts w:ascii="Arial Nova Cond" w:hAnsi="Arial Nova Cond" w:cs="Calibri"/>
+          <w:color w:val="000000" w:themeColor="text1"/>
+          <w:sz w:val="20"/>
+          <w:szCs w:val="20"/>
+        </w:rPr>
+        <w:t>.</w:t>
+      </w:r>
+    </w:p>
+    <w:p>
+      <w:pPr>
+        <w:spacing w:before="30" w:after="0"/>
+        <w:rPr>
+          <w:rFonts w:ascii="Arial Nova Cond" w:hAnsi="Arial Nova Cond"/>
+          <w:b/>
+          <w:smallCaps/>
+          <w:color w:val="000000" w:themeColor="text1"/>
+          <w:sz w:val="20"/>
+          <w:szCs w:val="20"/>
+        </w:rPr>
+      </w:pPr>
+      <w:r>
+        <w:rPr>
+          <w:rFonts w:ascii="Arial Nova Cond" w:hAnsi="Arial Nova Cond"/>
+          <w:b/>
+          <w:smallCaps/>
+          <w:color w:val="000000" w:themeColor="text1"/>
+          <w:sz w:val="20"/>
+          <w:szCs w:val="20"/>
+        </w:rPr>
+        <w:t>Roles and responsibilities</w:t>
       </w:r>
     </w:p>
     <w:p>
@@ -3162,398 +2801,16 @@
           <w:sz w:val="20"/>
           <w:szCs w:val="20"/>
         </w:rPr>
-        <w:t>Streamlined python project setup using Conda and Poetry.</w:t>
-      </w:r>
-    </w:p>
-    <w:p>
-      <w:pPr>
-        <w:spacing w:before="30" w:after="0"/>
-        <w:rPr>
-          <w:rFonts w:ascii="Arial Nova Cond" w:hAnsi="Arial Nova Cond"/>
-          <w:b/>
-          <w:smallCaps/>
-          <w:color w:val="000000" w:themeColor="text1"/>
-          <w:sz w:val="20"/>
-          <w:szCs w:val="20"/>
-        </w:rPr>
-      </w:pPr>
-    </w:p>
-    <w:p>
-      <w:pPr>
-        <w:spacing w:before="30" w:after="0"/>
-        <w:rPr>
-          <w:rFonts w:ascii="Arial Nova Cond" w:hAnsi="Arial Nova Cond"/>
-          <w:b/>
-          <w:smallCaps/>
-          <w:color w:val="000000" w:themeColor="text1"/>
-          <w:sz w:val="20"/>
-          <w:szCs w:val="20"/>
-        </w:rPr>
-      </w:pPr>
-      <w:r>
-        <w:rPr>
-          <w:rFonts w:ascii="Arial Nova Cond" w:hAnsi="Arial Nova Cond"/>
-          <w:b/>
-          <w:smallCaps/>
-          <w:color w:val="000000" w:themeColor="text1"/>
-          <w:sz w:val="20"/>
-          <w:szCs w:val="20"/>
-        </w:rPr>
-        <w:t>Project #</w:t>
-      </w:r>
-      <w:r>
-        <w:rPr>
-          <w:rFonts w:ascii="Arial Nova Cond" w:hAnsi="Arial Nova Cond"/>
-          <w:b/>
-          <w:smallCaps/>
-          <w:color w:val="000000" w:themeColor="text1"/>
-          <w:sz w:val="20"/>
-          <w:szCs w:val="20"/>
-        </w:rPr>
-        <w:t>3</w:t>
-      </w:r>
-      <w:r>
-        <w:rPr>
-          <w:rFonts w:ascii="Arial Nova Cond" w:hAnsi="Arial Nova Cond"/>
-          <w:b/>
-          <w:smallCaps/>
-          <w:color w:val="000000" w:themeColor="text1"/>
-          <w:sz w:val="20"/>
-          <w:szCs w:val="20"/>
-        </w:rPr>
-        <w:t xml:space="preserve"> – </w:t>
-      </w:r>
-      <w:proofErr w:type="spellStart"/>
-      <w:r>
-        <w:rPr>
-          <w:rFonts w:ascii="Arial Nova Cond" w:hAnsi="Arial Nova Cond"/>
-          <w:b/>
-          <w:smallCaps/>
-          <w:color w:val="000000" w:themeColor="text1"/>
-          <w:sz w:val="20"/>
-          <w:szCs w:val="20"/>
-        </w:rPr>
-        <w:t>JazzTrack</w:t>
-      </w:r>
-      <w:proofErr w:type="spellEnd"/>
-      <w:r>
-        <w:rPr>
-          <w:rFonts w:ascii="Arial Nova Cond" w:hAnsi="Arial Nova Cond"/>
-          <w:b/>
-          <w:smallCaps/>
-          <w:color w:val="000000" w:themeColor="text1"/>
-          <w:sz w:val="20"/>
-          <w:szCs w:val="20"/>
-        </w:rPr>
-        <w:t xml:space="preserve"> Management System</w:t>
-      </w:r>
-    </w:p>
-    <w:p>
-      <w:pPr>
-        <w:spacing w:before="30" w:after="0"/>
-        <w:rPr>
-          <w:rFonts w:ascii="Arial Nova Cond" w:hAnsi="Arial Nova Cond"/>
-          <w:color w:val="000000" w:themeColor="text1"/>
-          <w:sz w:val="20"/>
-          <w:szCs w:val="20"/>
-        </w:rPr>
-      </w:pPr>
-      <w:r>
-        <w:rPr>
-          <w:rFonts w:ascii="Arial Nova Cond" w:hAnsi="Arial Nova Cond"/>
-          <w:b/>
-          <w:smallCaps/>
-          <w:color w:val="000000" w:themeColor="text1"/>
-          <w:sz w:val="20"/>
-          <w:szCs w:val="20"/>
-        </w:rPr>
-        <w:t xml:space="preserve">Company Name </w:t>
-      </w:r>
-      <w:r>
-        <w:rPr>
-          <w:rFonts w:ascii="Arial Nova Cond" w:hAnsi="Arial Nova Cond"/>
-          <w:b/>
-          <w:smallCaps/>
-          <w:color w:val="000000" w:themeColor="text1"/>
-          <w:sz w:val="20"/>
-          <w:szCs w:val="20"/>
-        </w:rPr>
-        <w:t>–</w:t>
-      </w:r>
-      <w:r>
-        <w:rPr>
-          <w:rFonts w:ascii="Arial Nova Cond" w:hAnsi="Arial Nova Cond"/>
-          <w:b/>
-          <w:smallCaps/>
-          <w:color w:val="000000" w:themeColor="text1"/>
-          <w:sz w:val="20"/>
-          <w:szCs w:val="20"/>
-        </w:rPr>
-        <w:t xml:space="preserve"> </w:t>
-      </w:r>
-      <w:r>
-        <w:rPr>
-          <w:rFonts w:ascii="Arial Nova Cond" w:hAnsi="Arial Nova Cond"/>
-          <w:b/>
-          <w:smallCaps/>
-          <w:color w:val="000000" w:themeColor="text1"/>
-          <w:sz w:val="20"/>
-          <w:szCs w:val="20"/>
-        </w:rPr>
-        <w:t xml:space="preserve">33 Kuber India Advisory </w:t>
-      </w:r>
-      <w:proofErr w:type="spellStart"/>
-      <w:r>
-        <w:rPr>
-          <w:rFonts w:ascii="Arial Nova Cond" w:hAnsi="Arial Nova Cond"/>
-          <w:b/>
-          <w:smallCaps/>
-          <w:color w:val="000000" w:themeColor="text1"/>
-          <w:sz w:val="20"/>
-          <w:szCs w:val="20"/>
-        </w:rPr>
-        <w:t>Lpp</w:t>
-      </w:r>
-      <w:proofErr w:type="spellEnd"/>
-      <w:r>
-        <w:rPr>
-          <w:rFonts w:ascii="Arial Nova Cond" w:hAnsi="Arial Nova Cond"/>
-          <w:b/>
-          <w:smallCaps/>
+        <w:t>Built and optimized full-stack applications using React, Tailwind CSS, and MySQL</w:t>
+      </w:r>
+      <w:r>
+        <w:rPr>
+          <w:rFonts w:ascii="Arial Nova Cond" w:hAnsi="Arial Nova Cond" w:cs="Calibri"/>
           <w:color w:val="000000" w:themeColor="text1"/>
           <w:sz w:val="20"/>
           <w:szCs w:val="20"/>
         </w:rPr>
         <w:t>.</w:t>
-      </w:r>
-    </w:p>
-    <w:p>
-      <w:pPr>
-        <w:spacing w:before="30" w:after="0"/>
-        <w:rPr>
-          <w:rFonts w:ascii="Arial Nova Cond" w:hAnsi="Arial Nova Cond"/>
-          <w:color w:val="000000" w:themeColor="text1"/>
-          <w:sz w:val="20"/>
-          <w:szCs w:val="20"/>
-        </w:rPr>
-      </w:pPr>
-      <w:r>
-        <w:rPr>
-          <w:rFonts w:ascii="Arial Nova Cond" w:hAnsi="Arial Nova Cond"/>
-          <w:b/>
-          <w:smallCaps/>
-          <w:color w:val="000000" w:themeColor="text1"/>
-          <w:sz w:val="20"/>
-          <w:szCs w:val="20"/>
-        </w:rPr>
-        <w:t xml:space="preserve">Project Period - </w:t>
-      </w:r>
-      <w:r>
-        <w:rPr>
-          <w:rFonts w:ascii="Arial Nova Cond" w:hAnsi="Arial Nova Cond"/>
-          <w:b/>
-          <w:smallCaps/>
-          <w:color w:val="000000" w:themeColor="text1"/>
-          <w:sz w:val="20"/>
-          <w:szCs w:val="20"/>
-        </w:rPr>
-        <w:t>Sep</w:t>
-      </w:r>
-      <w:r>
-        <w:rPr>
-          <w:rFonts w:ascii="Arial Nova Cond" w:hAnsi="Arial Nova Cond"/>
-          <w:b/>
-          <w:smallCaps/>
-          <w:color w:val="000000" w:themeColor="text1"/>
-          <w:sz w:val="20"/>
-          <w:szCs w:val="20"/>
-        </w:rPr>
-        <w:t xml:space="preserve"> 202</w:t>
-      </w:r>
-      <w:r>
-        <w:rPr>
-          <w:rFonts w:ascii="Arial Nova Cond" w:hAnsi="Arial Nova Cond"/>
-          <w:b/>
-          <w:smallCaps/>
-          <w:color w:val="000000" w:themeColor="text1"/>
-          <w:sz w:val="20"/>
-          <w:szCs w:val="20"/>
-        </w:rPr>
-        <w:t>3</w:t>
-      </w:r>
-      <w:r>
-        <w:rPr>
-          <w:rFonts w:ascii="Arial Nova Cond" w:hAnsi="Arial Nova Cond"/>
-          <w:b/>
-          <w:smallCaps/>
-          <w:color w:val="000000" w:themeColor="text1"/>
-          <w:sz w:val="20"/>
-          <w:szCs w:val="20"/>
-        </w:rPr>
-        <w:t xml:space="preserve"> </w:t>
-      </w:r>
-      <w:r>
-        <w:rPr>
-          <w:rFonts w:ascii="Arial Nova Cond" w:hAnsi="Arial Nova Cond"/>
-          <w:b/>
-          <w:smallCaps/>
-          <w:color w:val="000000" w:themeColor="text1"/>
-          <w:sz w:val="20"/>
-          <w:szCs w:val="20"/>
-        </w:rPr>
-        <w:t>–</w:t>
-      </w:r>
-      <w:r>
-        <w:rPr>
-          <w:rFonts w:ascii="Arial Nova Cond" w:hAnsi="Arial Nova Cond"/>
-          <w:b/>
-          <w:smallCaps/>
-          <w:color w:val="000000" w:themeColor="text1"/>
-          <w:sz w:val="20"/>
-          <w:szCs w:val="20"/>
-        </w:rPr>
-        <w:t xml:space="preserve"> </w:t>
-      </w:r>
-      <w:r>
-        <w:rPr>
-          <w:rFonts w:ascii="Arial Nova Cond" w:hAnsi="Arial Nova Cond"/>
-          <w:b/>
-          <w:smallCaps/>
-          <w:color w:val="000000" w:themeColor="text1"/>
-          <w:sz w:val="20"/>
-          <w:szCs w:val="20"/>
-        </w:rPr>
-        <w:t>Jan</w:t>
-      </w:r>
-      <w:r>
-        <w:rPr>
-          <w:rFonts w:ascii="Arial Nova Cond" w:hAnsi="Arial Nova Cond"/>
-          <w:b/>
-          <w:smallCaps/>
-          <w:color w:val="000000" w:themeColor="text1"/>
-          <w:sz w:val="20"/>
-          <w:szCs w:val="20"/>
-        </w:rPr>
-        <w:t xml:space="preserve"> 202</w:t>
-      </w:r>
-      <w:r>
-        <w:rPr>
-          <w:rFonts w:ascii="Arial Nova Cond" w:hAnsi="Arial Nova Cond"/>
-          <w:b/>
-          <w:smallCaps/>
-          <w:color w:val="000000" w:themeColor="text1"/>
-          <w:sz w:val="20"/>
-          <w:szCs w:val="20"/>
-        </w:rPr>
-        <w:t>5</w:t>
-      </w:r>
-    </w:p>
-    <w:p>
-      <w:pPr>
-        <w:spacing w:before="30" w:after="0"/>
-        <w:rPr>
-          <w:rFonts w:ascii="Arial Nova Cond" w:hAnsi="Arial Nova Cond"/>
-          <w:color w:val="000000" w:themeColor="text1"/>
-          <w:sz w:val="20"/>
-          <w:szCs w:val="20"/>
-        </w:rPr>
-      </w:pPr>
-      <w:r>
-        <w:rPr>
-          <w:rFonts w:ascii="Arial Nova Cond" w:hAnsi="Arial Nova Cond"/>
-          <w:b/>
-          <w:smallCaps/>
-          <w:color w:val="000000" w:themeColor="text1"/>
-          <w:sz w:val="20"/>
-          <w:szCs w:val="20"/>
-        </w:rPr>
-        <w:t xml:space="preserve">Designation </w:t>
-      </w:r>
-      <w:r>
-        <w:rPr>
-          <w:rFonts w:ascii="Arial Nova Cond" w:hAnsi="Arial Nova Cond"/>
-          <w:b/>
-          <w:smallCaps/>
-          <w:color w:val="000000" w:themeColor="text1"/>
-          <w:sz w:val="20"/>
-          <w:szCs w:val="20"/>
-        </w:rPr>
-        <w:t>–</w:t>
-      </w:r>
-      <w:r>
-        <w:rPr>
-          <w:rFonts w:ascii="Arial Nova Cond" w:hAnsi="Arial Nova Cond"/>
-          <w:b/>
-          <w:smallCaps/>
-          <w:color w:val="000000" w:themeColor="text1"/>
-          <w:sz w:val="20"/>
-          <w:szCs w:val="20"/>
-        </w:rPr>
-        <w:t xml:space="preserve">Software </w:t>
-      </w:r>
-      <w:r>
-        <w:rPr>
-          <w:rFonts w:ascii="Arial Nova Cond" w:hAnsi="Arial Nova Cond"/>
-          <w:b/>
-          <w:smallCaps/>
-          <w:color w:val="000000" w:themeColor="text1"/>
-          <w:sz w:val="20"/>
-          <w:szCs w:val="20"/>
-        </w:rPr>
-        <w:t>Developer</w:t>
-      </w:r>
-    </w:p>
-    <w:p>
-      <w:pPr>
-        <w:spacing w:before="30" w:after="0"/>
-        <w:rPr>
-          <w:rFonts w:ascii="Arial Nova Cond" w:hAnsi="Arial Nova Cond" w:cs="Calibri"/>
-          <w:color w:val="000000" w:themeColor="text1"/>
-          <w:sz w:val="20"/>
-          <w:szCs w:val="20"/>
-        </w:rPr>
-      </w:pPr>
-      <w:r>
-        <w:rPr>
-          <w:rFonts w:ascii="Arial Nova Cond" w:hAnsi="Arial Nova Cond" w:cs="Calibri"/>
-          <w:color w:val="000000" w:themeColor="text1"/>
-          <w:sz w:val="20"/>
-          <w:szCs w:val="20"/>
-        </w:rPr>
-        <w:t>Designed and delivered robust full-stack web applications using React, Tailwind CSS, and MySQL, with seamless integration of CRM/CRS/SRC systems, efficient RESTful APIs, advanced database tuning using stored procedures and views, and automated testing frameworks that significantly enhanced software stability and reduced bugs</w:t>
-      </w:r>
-      <w:r>
-        <w:rPr>
-          <w:rFonts w:ascii="Arial Nova Cond" w:hAnsi="Arial Nova Cond" w:cs="Calibri"/>
-          <w:color w:val="000000" w:themeColor="text1"/>
-          <w:sz w:val="20"/>
-          <w:szCs w:val="20"/>
-        </w:rPr>
-        <w:t>.</w:t>
-      </w:r>
-    </w:p>
-    <w:p>
-      <w:pPr>
-        <w:spacing w:before="30" w:after="0"/>
-        <w:rPr>
-          <w:rFonts w:ascii="Arial Nova Cond" w:hAnsi="Arial Nova Cond"/>
-          <w:b/>
-          <w:smallCaps/>
-          <w:color w:val="000000" w:themeColor="text1"/>
-          <w:sz w:val="20"/>
-          <w:szCs w:val="20"/>
-        </w:rPr>
-      </w:pPr>
-      <w:r>
-        <w:rPr>
-          <w:rFonts w:ascii="Arial Nova Cond" w:hAnsi="Arial Nova Cond"/>
-          <w:b/>
-          <w:smallCaps/>
-          <w:color w:val="000000" w:themeColor="text1"/>
-          <w:sz w:val="20"/>
-          <w:szCs w:val="20"/>
-        </w:rPr>
-        <w:t>Roles and responsibilities</w:t>
       </w:r>
     </w:p>
     <w:p>
@@ -3578,7 +2835,7 @@
           <w:sz w:val="20"/>
           <w:szCs w:val="20"/>
         </w:rPr>
-        <w:t>Built and optimized full-stack applications using React, Tailwind CSS, and MySQL</w:t>
+        <w:t>Developed and deployed RESTful APIs, improving system performance</w:t>
       </w:r>
       <w:r>
         <w:rPr>
@@ -3612,7 +2869,7 @@
           <w:sz w:val="20"/>
           <w:szCs w:val="20"/>
         </w:rPr>
-        <w:t>Developed and deployed RESTful APIs, improving system performance</w:t>
+        <w:t>Integrated CRM, CRS, and SRC systems, enhancing customer data analytics</w:t>
       </w:r>
       <w:r>
         <w:rPr>
@@ -3646,61 +2903,7 @@
           <w:sz w:val="20"/>
           <w:szCs w:val="20"/>
         </w:rPr>
-        <w:t>Integrated CRM, CRS, and SRC systems, enhancing customer data analytics</w:t>
-      </w:r>
-      <w:r>
-        <w:rPr>
-          <w:rFonts w:ascii="Arial Nova Cond" w:hAnsi="Arial Nova Cond" w:cs="Calibri"/>
-          <w:color w:val="000000" w:themeColor="text1"/>
-          <w:sz w:val="20"/>
-          <w:szCs w:val="20"/>
-        </w:rPr>
-        <w:t>.</w:t>
-      </w:r>
-    </w:p>
-    <w:p>
-      <w:pPr>
-        <w:pStyle w:val="ListParagraph"/>
-        <w:numPr>
-          <w:ilvl w:val="0"/>
-          <w:numId w:val="35"/>
-        </w:numPr>
-        <w:spacing w:after="0"/>
-        <w:rPr>
-          <w:rFonts w:ascii="Arial Nova Cond" w:hAnsi="Arial Nova Cond" w:cs="Calibri"/>
-          <w:color w:val="000000" w:themeColor="text1"/>
-          <w:sz w:val="20"/>
-          <w:szCs w:val="20"/>
-        </w:rPr>
-      </w:pPr>
-      <w:r>
-        <w:rPr>
-          <w:rFonts w:ascii="Arial Nova Cond" w:hAnsi="Arial Nova Cond" w:cs="Calibri"/>
-          <w:color w:val="000000" w:themeColor="text1"/>
-          <w:sz w:val="20"/>
-          <w:szCs w:val="20"/>
-        </w:rPr>
-        <w:t xml:space="preserve">Implemented RESTful APIs using python Flask, </w:t>
-      </w:r>
-      <w:proofErr w:type="spellStart"/>
-      <w:r>
-        <w:rPr>
-          <w:rFonts w:ascii="Arial Nova Cond" w:hAnsi="Arial Nova Cond" w:cs="Calibri"/>
-          <w:color w:val="000000" w:themeColor="text1"/>
-          <w:sz w:val="20"/>
-          <w:szCs w:val="20"/>
-        </w:rPr>
-        <w:t>Mysql</w:t>
-      </w:r>
-      <w:proofErr w:type="spellEnd"/>
-      <w:r>
-        <w:rPr>
-          <w:rFonts w:ascii="Arial Nova Cond" w:hAnsi="Arial Nova Cond" w:cs="Calibri"/>
-          <w:color w:val="000000" w:themeColor="text1"/>
-          <w:sz w:val="20"/>
-          <w:szCs w:val="20"/>
-        </w:rPr>
-        <w:t>.</w:t>
+        <w:t>Implemented RESTful APIs using python Flask, Mysql.</w:t>
       </w:r>
     </w:p>
     <w:p>
@@ -4660,6 +3863,155 @@
     </w:lvl>
   </w:abstractNum>
   <w:abstractNum w:abstractNumId="7" w15:restartNumberingAfterBreak="0">
+    <w:nsid w:val="10D61664"/>
+    <w:multiLevelType w:val="multilevel"/>
+    <w:tmpl w:val="3FB8D796"/>
+    <w:lvl w:ilvl="0">
+      <w:start w:val="1"/>
+      <w:numFmt w:val="bullet"/>
+      <w:lvlText w:val=""/>
+      <w:lvlJc w:val="left"/>
+      <w:pPr>
+        <w:tabs>
+          <w:tab w:val="num" w:pos="720"/>
+        </w:tabs>
+        <w:ind w:left="720" w:hanging="360"/>
+      </w:pPr>
+      <w:rPr>
+        <w:rFonts w:ascii="Symbol" w:hAnsi="Symbol" w:hint="default"/>
+        <w:sz w:val="20"/>
+      </w:rPr>
+    </w:lvl>
+    <w:lvl w:ilvl="1" w:tentative="1">
+      <w:start w:val="1"/>
+      <w:numFmt w:val="bullet"/>
+      <w:lvlText w:val="o"/>
+      <w:lvlJc w:val="left"/>
+      <w:pPr>
+        <w:tabs>
+          <w:tab w:val="num" w:pos="1440"/>
+        </w:tabs>
+        <w:ind w:left="1440" w:hanging="360"/>
+      </w:pPr>
+      <w:rPr>
+        <w:rFonts w:ascii="Courier New" w:hAnsi="Courier New" w:hint="default"/>
+        <w:sz w:val="20"/>
+      </w:rPr>
+    </w:lvl>
+    <w:lvl w:ilvl="2" w:tentative="1">
+      <w:start w:val="1"/>
+      <w:numFmt w:val="bullet"/>
+      <w:lvlText w:val=""/>
+      <w:lvlJc w:val="left"/>
+      <w:pPr>
+        <w:tabs>
+          <w:tab w:val="num" w:pos="2160"/>
+        </w:tabs>
+        <w:ind w:left="2160" w:hanging="360"/>
+      </w:pPr>
+      <w:rPr>
+        <w:rFonts w:ascii="Wingdings" w:hAnsi="Wingdings" w:hint="default"/>
+        <w:sz w:val="20"/>
+      </w:rPr>
+    </w:lvl>
+    <w:lvl w:ilvl="3" w:tentative="1">
+      <w:start w:val="1"/>
+      <w:numFmt w:val="bullet"/>
+      <w:lvlText w:val=""/>
+      <w:lvlJc w:val="left"/>
+      <w:pPr>
+        <w:tabs>
+          <w:tab w:val="num" w:pos="2880"/>
+        </w:tabs>
+        <w:ind w:left="2880" w:hanging="360"/>
+      </w:pPr>
+      <w:rPr>
+        <w:rFonts w:ascii="Wingdings" w:hAnsi="Wingdings" w:hint="default"/>
+        <w:sz w:val="20"/>
+      </w:rPr>
+    </w:lvl>
+    <w:lvl w:ilvl="4" w:tentative="1">
+      <w:start w:val="1"/>
+      <w:numFmt w:val="bullet"/>
+      <w:lvlText w:val=""/>
+      <w:lvlJc w:val="left"/>
+      <w:pPr>
+        <w:tabs>
+          <w:tab w:val="num" w:pos="3600"/>
+        </w:tabs>
+        <w:ind w:left="3600" w:hanging="360"/>
+      </w:pPr>
+      <w:rPr>
+        <w:rFonts w:ascii="Wingdings" w:hAnsi="Wingdings" w:hint="default"/>
+        <w:sz w:val="20"/>
+      </w:rPr>
+    </w:lvl>
+    <w:lvl w:ilvl="5" w:tentative="1">
+      <w:start w:val="1"/>
+      <w:numFmt w:val="bullet"/>
+      <w:lvlText w:val=""/>
+      <w:lvlJc w:val="left"/>
+      <w:pPr>
+        <w:tabs>
+          <w:tab w:val="num" w:pos="4320"/>
+        </w:tabs>
+        <w:ind w:left="4320" w:hanging="360"/>
+      </w:pPr>
+      <w:rPr>
+        <w:rFonts w:ascii="Wingdings" w:hAnsi="Wingdings" w:hint="default"/>
+        <w:sz w:val="20"/>
+      </w:rPr>
+    </w:lvl>
+    <w:lvl w:ilvl="6" w:tentative="1">
+      <w:start w:val="1"/>
+      <w:numFmt w:val="bullet"/>
+      <w:lvlText w:val=""/>
+      <w:lvlJc w:val="left"/>
+      <w:pPr>
+        <w:tabs>
+          <w:tab w:val="num" w:pos="5040"/>
+        </w:tabs>
+        <w:ind w:left="5040" w:hanging="360"/>
+      </w:pPr>
+      <w:rPr>
+        <w:rFonts w:ascii="Wingdings" w:hAnsi="Wingdings" w:hint="default"/>
+        <w:sz w:val="20"/>
+      </w:rPr>
+    </w:lvl>
+    <w:lvl w:ilvl="7" w:tentative="1">
+      <w:start w:val="1"/>
+      <w:numFmt w:val="bullet"/>
+      <w:lvlText w:val=""/>
+      <w:lvlJc w:val="left"/>
+      <w:pPr>
+        <w:tabs>
+          <w:tab w:val="num" w:pos="5760"/>
+        </w:tabs>
+        <w:ind w:left="5760" w:hanging="360"/>
+      </w:pPr>
+      <w:rPr>
+        <w:rFonts w:ascii="Wingdings" w:hAnsi="Wingdings" w:hint="default"/>
+        <w:sz w:val="20"/>
+      </w:rPr>
+    </w:lvl>
+    <w:lvl w:ilvl="8" w:tentative="1">
+      <w:start w:val="1"/>
+      <w:numFmt w:val="bullet"/>
+      <w:lvlText w:val=""/>
+      <w:lvlJc w:val="left"/>
+      <w:pPr>
+        <w:tabs>
+          <w:tab w:val="num" w:pos="6480"/>
+        </w:tabs>
+        <w:ind w:left="6480" w:hanging="360"/>
+      </w:pPr>
+      <w:rPr>
+        <w:rFonts w:ascii="Wingdings" w:hAnsi="Wingdings" w:hint="default"/>
+        <w:sz w:val="20"/>
+      </w:rPr>
+    </w:lvl>
+  </w:abstractNum>
+  <w:abstractNum w:abstractNumId="8" w15:restartNumberingAfterBreak="0">
     <w:nsid w:val="160A3DFD"/>
     <w:multiLevelType w:val="hybridMultilevel"/>
     <w:tmpl w:val="A030F688"/>
@@ -4772,7 +4124,7 @@
       </w:rPr>
     </w:lvl>
   </w:abstractNum>
-  <w:abstractNum w:abstractNumId="8" w15:restartNumberingAfterBreak="0">
+  <w:abstractNum w:abstractNumId="9" w15:restartNumberingAfterBreak="0">
     <w:nsid w:val="162134BC"/>
     <w:multiLevelType w:val="hybridMultilevel"/>
     <w:tmpl w:val="B1B8921A"/>
@@ -4913,7 +4265,7 @@
       </w:rPr>
     </w:lvl>
   </w:abstractNum>
-  <w:abstractNum w:abstractNumId="9" w15:restartNumberingAfterBreak="0">
+  <w:abstractNum w:abstractNumId="10" w15:restartNumberingAfterBreak="0">
     <w:nsid w:val="179D288F"/>
     <w:multiLevelType w:val="hybridMultilevel"/>
     <w:tmpl w:val="86E6BADE"/>
@@ -5026,7 +4378,7 @@
       </w:rPr>
     </w:lvl>
   </w:abstractNum>
-  <w:abstractNum w:abstractNumId="10" w15:restartNumberingAfterBreak="0">
+  <w:abstractNum w:abstractNumId="11" w15:restartNumberingAfterBreak="0">
     <w:nsid w:val="1A70700C"/>
     <w:multiLevelType w:val="hybridMultilevel"/>
     <w:tmpl w:val="B9940542"/>
@@ -5139,7 +4491,7 @@
       </w:rPr>
     </w:lvl>
   </w:abstractNum>
-  <w:abstractNum w:abstractNumId="11" w15:restartNumberingAfterBreak="0">
+  <w:abstractNum w:abstractNumId="12" w15:restartNumberingAfterBreak="0">
     <w:nsid w:val="1CF512F8"/>
     <w:multiLevelType w:val="hybridMultilevel"/>
     <w:tmpl w:val="EEFA7E80"/>
@@ -5253,7 +4605,7 @@
       </w:rPr>
     </w:lvl>
   </w:abstractNum>
-  <w:abstractNum w:abstractNumId="12" w15:restartNumberingAfterBreak="0">
+  <w:abstractNum w:abstractNumId="13" w15:restartNumberingAfterBreak="0">
     <w:nsid w:val="2064579C"/>
     <w:multiLevelType w:val="hybridMultilevel"/>
     <w:tmpl w:val="7BDC3FB8"/>
@@ -5367,7 +4719,156 @@
       </w:rPr>
     </w:lvl>
   </w:abstractNum>
-  <w:abstractNum w:abstractNumId="13" w15:restartNumberingAfterBreak="0">
+  <w:abstractNum w:abstractNumId="14" w15:restartNumberingAfterBreak="0">
+    <w:nsid w:val="2F934BBF"/>
+    <w:multiLevelType w:val="multilevel"/>
+    <w:tmpl w:val="43407E72"/>
+    <w:lvl w:ilvl="0">
+      <w:start w:val="1"/>
+      <w:numFmt w:val="bullet"/>
+      <w:lvlText w:val=""/>
+      <w:lvlJc w:val="left"/>
+      <w:pPr>
+        <w:tabs>
+          <w:tab w:val="num" w:pos="720"/>
+        </w:tabs>
+        <w:ind w:left="720" w:hanging="360"/>
+      </w:pPr>
+      <w:rPr>
+        <w:rFonts w:ascii="Symbol" w:hAnsi="Symbol" w:hint="default"/>
+        <w:sz w:val="20"/>
+      </w:rPr>
+    </w:lvl>
+    <w:lvl w:ilvl="1" w:tentative="1">
+      <w:start w:val="1"/>
+      <w:numFmt w:val="bullet"/>
+      <w:lvlText w:val="o"/>
+      <w:lvlJc w:val="left"/>
+      <w:pPr>
+        <w:tabs>
+          <w:tab w:val="num" w:pos="1440"/>
+        </w:tabs>
+        <w:ind w:left="1440" w:hanging="360"/>
+      </w:pPr>
+      <w:rPr>
+        <w:rFonts w:ascii="Courier New" w:hAnsi="Courier New" w:hint="default"/>
+        <w:sz w:val="20"/>
+      </w:rPr>
+    </w:lvl>
+    <w:lvl w:ilvl="2" w:tentative="1">
+      <w:start w:val="1"/>
+      <w:numFmt w:val="bullet"/>
+      <w:lvlText w:val=""/>
+      <w:lvlJc w:val="left"/>
+      <w:pPr>
+        <w:tabs>
+          <w:tab w:val="num" w:pos="2160"/>
+        </w:tabs>
+        <w:ind w:left="2160" w:hanging="360"/>
+      </w:pPr>
+      <w:rPr>
+        <w:rFonts w:ascii="Wingdings" w:hAnsi="Wingdings" w:hint="default"/>
+        <w:sz w:val="20"/>
+      </w:rPr>
+    </w:lvl>
+    <w:lvl w:ilvl="3" w:tentative="1">
+      <w:start w:val="1"/>
+      <w:numFmt w:val="bullet"/>
+      <w:lvlText w:val=""/>
+      <w:lvlJc w:val="left"/>
+      <w:pPr>
+        <w:tabs>
+          <w:tab w:val="num" w:pos="2880"/>
+        </w:tabs>
+        <w:ind w:left="2880" w:hanging="360"/>
+      </w:pPr>
+      <w:rPr>
+        <w:rFonts w:ascii="Wingdings" w:hAnsi="Wingdings" w:hint="default"/>
+        <w:sz w:val="20"/>
+      </w:rPr>
+    </w:lvl>
+    <w:lvl w:ilvl="4" w:tentative="1">
+      <w:start w:val="1"/>
+      <w:numFmt w:val="bullet"/>
+      <w:lvlText w:val=""/>
+      <w:lvlJc w:val="left"/>
+      <w:pPr>
+        <w:tabs>
+          <w:tab w:val="num" w:pos="3600"/>
+        </w:tabs>
+        <w:ind w:left="3600" w:hanging="360"/>
+      </w:pPr>
+      <w:rPr>
+        <w:rFonts w:ascii="Wingdings" w:hAnsi="Wingdings" w:hint="default"/>
+        <w:sz w:val="20"/>
+      </w:rPr>
+    </w:lvl>
+    <w:lvl w:ilvl="5" w:tentative="1">
+      <w:start w:val="1"/>
+      <w:numFmt w:val="bullet"/>
+      <w:lvlText w:val=""/>
+      <w:lvlJc w:val="left"/>
+      <w:pPr>
+        <w:tabs>
+          <w:tab w:val="num" w:pos="4320"/>
+        </w:tabs>
+        <w:ind w:left="4320" w:hanging="360"/>
+      </w:pPr>
+      <w:rPr>
+        <w:rFonts w:ascii="Wingdings" w:hAnsi="Wingdings" w:hint="default"/>
+        <w:sz w:val="20"/>
+      </w:rPr>
+    </w:lvl>
+    <w:lvl w:ilvl="6" w:tentative="1">
+      <w:start w:val="1"/>
+      <w:numFmt w:val="bullet"/>
+      <w:lvlText w:val=""/>
+      <w:lvlJc w:val="left"/>
+      <w:pPr>
+        <w:tabs>
+          <w:tab w:val="num" w:pos="5040"/>
+        </w:tabs>
+        <w:ind w:left="5040" w:hanging="360"/>
+      </w:pPr>
+      <w:rPr>
+        <w:rFonts w:ascii="Wingdings" w:hAnsi="Wingdings" w:hint="default"/>
+        <w:sz w:val="20"/>
+      </w:rPr>
+    </w:lvl>
+    <w:lvl w:ilvl="7" w:tentative="1">
+      <w:start w:val="1"/>
+      <w:numFmt w:val="bullet"/>
+      <w:lvlText w:val=""/>
+      <w:lvlJc w:val="left"/>
+      <w:pPr>
+        <w:tabs>
+          <w:tab w:val="num" w:pos="5760"/>
+        </w:tabs>
+        <w:ind w:left="5760" w:hanging="360"/>
+      </w:pPr>
+      <w:rPr>
+        <w:rFonts w:ascii="Wingdings" w:hAnsi="Wingdings" w:hint="default"/>
+        <w:sz w:val="20"/>
+      </w:rPr>
+    </w:lvl>
+    <w:lvl w:ilvl="8" w:tentative="1">
+      <w:start w:val="1"/>
+      <w:numFmt w:val="bullet"/>
+      <w:lvlText w:val=""/>
+      <w:lvlJc w:val="left"/>
+      <w:pPr>
+        <w:tabs>
+          <w:tab w:val="num" w:pos="6480"/>
+        </w:tabs>
+        <w:ind w:left="6480" w:hanging="360"/>
+      </w:pPr>
+      <w:rPr>
+        <w:rFonts w:ascii="Wingdings" w:hAnsi="Wingdings" w:hint="default"/>
+        <w:sz w:val="20"/>
+      </w:rPr>
+    </w:lvl>
+  </w:abstractNum>
+  <w:abstractNum w:abstractNumId="15" w15:restartNumberingAfterBreak="0">
     <w:nsid w:val="30A74216"/>
     <w:multiLevelType w:val="hybridMultilevel"/>
     <w:tmpl w:val="F998CF88"/>
@@ -5480,7 +4981,7 @@
       </w:rPr>
     </w:lvl>
   </w:abstractNum>
-  <w:abstractNum w:abstractNumId="14" w15:restartNumberingAfterBreak="0">
+  <w:abstractNum w:abstractNumId="16" w15:restartNumberingAfterBreak="0">
     <w:nsid w:val="376016A4"/>
     <w:multiLevelType w:val="hybridMultilevel"/>
     <w:tmpl w:val="C4244E9A"/>
@@ -5593,7 +5094,7 @@
       </w:rPr>
     </w:lvl>
   </w:abstractNum>
-  <w:abstractNum w:abstractNumId="15" w15:restartNumberingAfterBreak="0">
+  <w:abstractNum w:abstractNumId="17" w15:restartNumberingAfterBreak="0">
     <w:nsid w:val="377F4873"/>
     <w:multiLevelType w:val="multilevel"/>
     <w:tmpl w:val="3E9088C0"/>
@@ -5644,7 +5145,7 @@
       <w:lvlJc w:val="left"/>
     </w:lvl>
   </w:abstractNum>
-  <w:abstractNum w:abstractNumId="16" w15:restartNumberingAfterBreak="0">
+  <w:abstractNum w:abstractNumId="18" w15:restartNumberingAfterBreak="0">
     <w:nsid w:val="3CE60E58"/>
     <w:multiLevelType w:val="hybridMultilevel"/>
     <w:tmpl w:val="F922355A"/>
@@ -5758,7 +5259,7 @@
       </w:rPr>
     </w:lvl>
   </w:abstractNum>
-  <w:abstractNum w:abstractNumId="17" w15:restartNumberingAfterBreak="0">
+  <w:abstractNum w:abstractNumId="19" w15:restartNumberingAfterBreak="0">
     <w:nsid w:val="3F027DD5"/>
     <w:multiLevelType w:val="hybridMultilevel"/>
     <w:tmpl w:val="46686BB8"/>
@@ -5871,7 +5372,7 @@
       </w:rPr>
     </w:lvl>
   </w:abstractNum>
-  <w:abstractNum w:abstractNumId="18" w15:restartNumberingAfterBreak="0">
+  <w:abstractNum w:abstractNumId="20" w15:restartNumberingAfterBreak="0">
     <w:nsid w:val="44105E16"/>
     <w:multiLevelType w:val="hybridMultilevel"/>
     <w:tmpl w:val="6F9ACDCC"/>
@@ -5984,7 +5485,7 @@
       </w:rPr>
     </w:lvl>
   </w:abstractNum>
-  <w:abstractNum w:abstractNumId="19" w15:restartNumberingAfterBreak="0">
+  <w:abstractNum w:abstractNumId="21" w15:restartNumberingAfterBreak="0">
     <w:nsid w:val="44373053"/>
     <w:multiLevelType w:val="hybridMultilevel"/>
     <w:tmpl w:val="45985842"/>
@@ -6098,7 +5599,7 @@
       </w:rPr>
     </w:lvl>
   </w:abstractNum>
-  <w:abstractNum w:abstractNumId="20" w15:restartNumberingAfterBreak="0">
+  <w:abstractNum w:abstractNumId="22" w15:restartNumberingAfterBreak="0">
     <w:nsid w:val="44A23807"/>
     <w:multiLevelType w:val="hybridMultilevel"/>
     <w:tmpl w:val="3F028322"/>
@@ -6211,7 +5712,7 @@
       </w:rPr>
     </w:lvl>
   </w:abstractNum>
-  <w:abstractNum w:abstractNumId="21" w15:restartNumberingAfterBreak="0">
+  <w:abstractNum w:abstractNumId="23" w15:restartNumberingAfterBreak="0">
     <w:nsid w:val="46474DCD"/>
     <w:multiLevelType w:val="hybridMultilevel"/>
     <w:tmpl w:val="E716D752"/>
@@ -6324,7 +5825,7 @@
       </w:rPr>
     </w:lvl>
   </w:abstractNum>
-  <w:abstractNum w:abstractNumId="22" w15:restartNumberingAfterBreak="0">
+  <w:abstractNum w:abstractNumId="24" w15:restartNumberingAfterBreak="0">
     <w:nsid w:val="48F3586A"/>
     <w:multiLevelType w:val="multilevel"/>
     <w:tmpl w:val="37C04FE2"/>
@@ -6375,7 +5876,7 @@
       <w:lvlJc w:val="left"/>
     </w:lvl>
   </w:abstractNum>
-  <w:abstractNum w:abstractNumId="23" w15:restartNumberingAfterBreak="0">
+  <w:abstractNum w:abstractNumId="25" w15:restartNumberingAfterBreak="0">
     <w:nsid w:val="49A9144D"/>
     <w:multiLevelType w:val="multilevel"/>
     <w:tmpl w:val="0608D7F6"/>
@@ -6426,7 +5927,7 @@
       <w:lvlJc w:val="left"/>
     </w:lvl>
   </w:abstractNum>
-  <w:abstractNum w:abstractNumId="24" w15:restartNumberingAfterBreak="0">
+  <w:abstractNum w:abstractNumId="26" w15:restartNumberingAfterBreak="0">
     <w:nsid w:val="4CD43830"/>
     <w:multiLevelType w:val="hybridMultilevel"/>
     <w:tmpl w:val="8CF648CE"/>
@@ -6539,7 +6040,7 @@
       </w:rPr>
     </w:lvl>
   </w:abstractNum>
-  <w:abstractNum w:abstractNumId="25" w15:restartNumberingAfterBreak="0">
+  <w:abstractNum w:abstractNumId="27" w15:restartNumberingAfterBreak="0">
     <w:nsid w:val="4E182EE0"/>
     <w:multiLevelType w:val="hybridMultilevel"/>
     <w:tmpl w:val="F1D2AE34"/>
@@ -6652,7 +6153,7 @@
       </w:rPr>
     </w:lvl>
   </w:abstractNum>
-  <w:abstractNum w:abstractNumId="26" w15:restartNumberingAfterBreak="0">
+  <w:abstractNum w:abstractNumId="28" w15:restartNumberingAfterBreak="0">
     <w:nsid w:val="57F05B81"/>
     <w:multiLevelType w:val="multilevel"/>
     <w:tmpl w:val="63EA8172"/>
@@ -6703,7 +6204,7 @@
       <w:lvlJc w:val="left"/>
     </w:lvl>
   </w:abstractNum>
-  <w:abstractNum w:abstractNumId="27" w15:restartNumberingAfterBreak="0">
+  <w:abstractNum w:abstractNumId="29" w15:restartNumberingAfterBreak="0">
     <w:nsid w:val="5A814E74"/>
     <w:multiLevelType w:val="multilevel"/>
     <w:tmpl w:val="164A9B4A"/>
@@ -6754,7 +6255,7 @@
       <w:lvlJc w:val="left"/>
     </w:lvl>
   </w:abstractNum>
-  <w:abstractNum w:abstractNumId="28" w15:restartNumberingAfterBreak="0">
+  <w:abstractNum w:abstractNumId="30" w15:restartNumberingAfterBreak="0">
     <w:nsid w:val="63A759FC"/>
     <w:multiLevelType w:val="hybridMultilevel"/>
     <w:tmpl w:val="7ED05ED0"/>
@@ -6868,7 +6369,7 @@
       </w:rPr>
     </w:lvl>
   </w:abstractNum>
-  <w:abstractNum w:abstractNumId="29" w15:restartNumberingAfterBreak="0">
+  <w:abstractNum w:abstractNumId="31" w15:restartNumberingAfterBreak="0">
     <w:nsid w:val="6AFC0B1E"/>
     <w:multiLevelType w:val="hybridMultilevel"/>
     <w:tmpl w:val="7D5EF500"/>
@@ -6981,7 +6482,7 @@
       </w:rPr>
     </w:lvl>
   </w:abstractNum>
-  <w:abstractNum w:abstractNumId="30" w15:restartNumberingAfterBreak="0">
+  <w:abstractNum w:abstractNumId="32" w15:restartNumberingAfterBreak="0">
     <w:nsid w:val="6E230C41"/>
     <w:multiLevelType w:val="hybridMultilevel"/>
     <w:tmpl w:val="778A8932"/>
@@ -7095,7 +6596,7 @@
       </w:rPr>
     </w:lvl>
   </w:abstractNum>
-  <w:abstractNum w:abstractNumId="31" w15:restartNumberingAfterBreak="0">
+  <w:abstractNum w:abstractNumId="33" w15:restartNumberingAfterBreak="0">
     <w:nsid w:val="6E365D44"/>
     <w:multiLevelType w:val="hybridMultilevel"/>
     <w:tmpl w:val="9DC2AF40"/>
@@ -7208,7 +6709,7 @@
       </w:rPr>
     </w:lvl>
   </w:abstractNum>
-  <w:abstractNum w:abstractNumId="32" w15:restartNumberingAfterBreak="0">
+  <w:abstractNum w:abstractNumId="34" w15:restartNumberingAfterBreak="0">
     <w:nsid w:val="6E4F0DE6"/>
     <w:multiLevelType w:val="multilevel"/>
     <w:tmpl w:val="CCDE1A0C"/>
@@ -7259,7 +6760,7 @@
       <w:lvlJc w:val="left"/>
     </w:lvl>
   </w:abstractNum>
-  <w:abstractNum w:abstractNumId="33" w15:restartNumberingAfterBreak="0">
+  <w:abstractNum w:abstractNumId="35" w15:restartNumberingAfterBreak="0">
     <w:nsid w:val="75482CC2"/>
     <w:multiLevelType w:val="multilevel"/>
     <w:tmpl w:val="79A06224"/>
@@ -7310,7 +6811,7 @@
       <w:lvlJc w:val="left"/>
     </w:lvl>
   </w:abstractNum>
-  <w:abstractNum w:abstractNumId="34" w15:restartNumberingAfterBreak="0">
+  <w:abstractNum w:abstractNumId="36" w15:restartNumberingAfterBreak="0">
     <w:nsid w:val="7E75150F"/>
     <w:multiLevelType w:val="hybridMultilevel"/>
     <w:tmpl w:val="09E021DA"/>
@@ -7423,7 +6924,7 @@
       </w:rPr>
     </w:lvl>
   </w:abstractNum>
-  <w:abstractNum w:abstractNumId="35" w15:restartNumberingAfterBreak="0">
+  <w:abstractNum w:abstractNumId="37" w15:restartNumberingAfterBreak="0">
     <w:nsid w:val="7EAC587C"/>
     <w:multiLevelType w:val="hybridMultilevel"/>
     <w:tmpl w:val="15442AAC"/>
@@ -7537,31 +7038,31 @@
     </w:lvl>
   </w:abstractNum>
   <w:num w:numId="1" w16cid:durableId="1748724578">
-    <w:abstractNumId w:val="15"/>
+    <w:abstractNumId w:val="17"/>
   </w:num>
   <w:num w:numId="2" w16cid:durableId="111368937">
-    <w:abstractNumId w:val="33"/>
+    <w:abstractNumId w:val="35"/>
   </w:num>
   <w:num w:numId="3" w16cid:durableId="479536840">
-    <w:abstractNumId w:val="27"/>
+    <w:abstractNumId w:val="29"/>
   </w:num>
   <w:num w:numId="4" w16cid:durableId="1016083183">
-    <w:abstractNumId w:val="23"/>
+    <w:abstractNumId w:val="25"/>
   </w:num>
   <w:num w:numId="5" w16cid:durableId="1101949071">
-    <w:abstractNumId w:val="26"/>
+    <w:abstractNumId w:val="28"/>
   </w:num>
   <w:num w:numId="6" w16cid:durableId="1057239076">
     <w:abstractNumId w:val="6"/>
   </w:num>
   <w:num w:numId="7" w16cid:durableId="31268022">
-    <w:abstractNumId w:val="22"/>
+    <w:abstractNumId w:val="24"/>
   </w:num>
   <w:num w:numId="8" w16cid:durableId="367219575">
-    <w:abstractNumId w:val="32"/>
+    <w:abstractNumId w:val="34"/>
   </w:num>
   <w:num w:numId="9" w16cid:durableId="1557164617">
-    <w:abstractNumId w:val="35"/>
+    <w:abstractNumId w:val="37"/>
   </w:num>
   <w:num w:numId="10" w16cid:durableId="875895368">
     <w:abstractNumId w:val="0"/>
@@ -7573,82 +7074,88 @@
     <w:abstractNumId w:val="2"/>
   </w:num>
   <w:num w:numId="13" w16cid:durableId="1110465383">
-    <w:abstractNumId w:val="21"/>
+    <w:abstractNumId w:val="23"/>
   </w:num>
   <w:num w:numId="14" w16cid:durableId="1980455704">
-    <w:abstractNumId w:val="16"/>
+    <w:abstractNumId w:val="18"/>
   </w:num>
   <w:num w:numId="15" w16cid:durableId="1317227507">
-    <w:abstractNumId w:val="11"/>
+    <w:abstractNumId w:val="12"/>
   </w:num>
   <w:num w:numId="16" w16cid:durableId="17856495">
-    <w:abstractNumId w:val="30"/>
+    <w:abstractNumId w:val="32"/>
   </w:num>
   <w:num w:numId="17" w16cid:durableId="986856593">
-    <w:abstractNumId w:val="19"/>
+    <w:abstractNumId w:val="21"/>
   </w:num>
   <w:num w:numId="18" w16cid:durableId="1590314701">
     <w:abstractNumId w:val="1"/>
   </w:num>
   <w:num w:numId="19" w16cid:durableId="381444310">
-    <w:abstractNumId w:val="12"/>
+    <w:abstractNumId w:val="13"/>
   </w:num>
   <w:num w:numId="20" w16cid:durableId="581069481">
+    <w:abstractNumId w:val="33"/>
+  </w:num>
+  <w:num w:numId="21" w16cid:durableId="1931084519">
     <w:abstractNumId w:val="31"/>
   </w:num>
-  <w:num w:numId="21" w16cid:durableId="1931084519">
-    <w:abstractNumId w:val="29"/>
-  </w:num>
   <w:num w:numId="22" w16cid:durableId="279150545">
-    <w:abstractNumId w:val="18"/>
+    <w:abstractNumId w:val="20"/>
   </w:num>
   <w:num w:numId="23" w16cid:durableId="1607811128">
     <w:abstractNumId w:val="3"/>
   </w:num>
   <w:num w:numId="24" w16cid:durableId="1012879462">
-    <w:abstractNumId w:val="24"/>
+    <w:abstractNumId w:val="26"/>
   </w:num>
   <w:num w:numId="25" w16cid:durableId="1959138637">
-    <w:abstractNumId w:val="7"/>
+    <w:abstractNumId w:val="8"/>
   </w:num>
   <w:num w:numId="26" w16cid:durableId="1425415027">
-    <w:abstractNumId w:val="25"/>
+    <w:abstractNumId w:val="27"/>
   </w:num>
   <w:num w:numId="27" w16cid:durableId="864320480">
-    <w:abstractNumId w:val="8"/>
+    <w:abstractNumId w:val="9"/>
   </w:num>
   <w:num w:numId="28" w16cid:durableId="1787962246">
-    <w:abstractNumId w:val="28"/>
+    <w:abstractNumId w:val="30"/>
   </w:num>
   <w:num w:numId="29" w16cid:durableId="200024078">
+    <w:abstractNumId w:val="10"/>
+  </w:num>
+  <w:num w:numId="30" w16cid:durableId="2067602081">
+    <w:abstractNumId w:val="16"/>
+  </w:num>
+  <w:num w:numId="31" w16cid:durableId="157231493">
     <w:abstractNumId w:val="9"/>
   </w:num>
-  <w:num w:numId="30" w16cid:durableId="2067602081">
-    <w:abstractNumId w:val="14"/>
-  </w:num>
-  <w:num w:numId="31" w16cid:durableId="157231493">
-    <w:abstractNumId w:val="8"/>
-  </w:num>
   <w:num w:numId="32" w16cid:durableId="1782803175">
-    <w:abstractNumId w:val="28"/>
+    <w:abstractNumId w:val="30"/>
   </w:num>
   <w:num w:numId="33" w16cid:durableId="1485506924">
-    <w:abstractNumId w:val="34"/>
+    <w:abstractNumId w:val="36"/>
   </w:num>
   <w:num w:numId="34" w16cid:durableId="1127940168">
-    <w:abstractNumId w:val="17"/>
+    <w:abstractNumId w:val="19"/>
   </w:num>
   <w:num w:numId="35" w16cid:durableId="213547516">
     <w:abstractNumId w:val="4"/>
   </w:num>
   <w:num w:numId="36" w16cid:durableId="691303152">
-    <w:abstractNumId w:val="20"/>
+    <w:abstractNumId w:val="22"/>
   </w:num>
   <w:num w:numId="37" w16cid:durableId="1834181092">
-    <w:abstractNumId w:val="13"/>
+    <w:abstractNumId w:val="15"/>
   </w:num>
   <w:num w:numId="38" w16cid:durableId="479424563">
-    <w:abstractNumId w:val="10"/>
+    <w:abstractNumId w:val="11"/>
+  </w:num>
+  <w:num w:numId="39" w16cid:durableId="709496977">
+    <w:abstractNumId w:val="7"/>
+  </w:num>
+  <w:num w:numId="40" w16cid:durableId="981152180">
+    <w:abstractNumId w:val="14"/>
   </w:num>
 </w:numbering>
 </file>
@@ -8081,6 +7588,7 @@
   <w:style w:type="character" w:default="1" w:styleId="DefaultParagraphFont">
     <w:name w:val="Default Paragraph Font"/>
     <w:uiPriority w:val="1"/>
+    <w:semiHidden/>
     <w:unhideWhenUsed/>
   </w:style>
   <w:style w:type="table" w:default="1" w:styleId="TableNormal">
@@ -8218,6 +7726,33 @@
     <w:rPr>
       <w:color w:val="800080" w:themeColor="followedHyperlink"/>
       <w:u w:val="single"/>
+    </w:rPr>
+  </w:style>
+  <w:style w:type="paragraph" w:styleId="NormalWeb">
+    <w:name w:val="Normal (Web)"/>
+    <w:basedOn w:val="Normal"/>
+    <w:uiPriority w:val="99"/>
+    <w:unhideWhenUsed/>
+    <w:rsid w:val="00661575"/>
+    <w:pPr>
+      <w:spacing w:before="100" w:beforeAutospacing="1" w:after="100" w:afterAutospacing="1" w:line="240" w:lineRule="auto"/>
+    </w:pPr>
+    <w:rPr>
+      <w:rFonts w:ascii="Times New Roman" w:eastAsia="Times New Roman" w:hAnsi="Times New Roman" w:cs="Times New Roman"/>
+      <w:sz w:val="24"/>
+      <w:szCs w:val="24"/>
+      <w:lang w:val="en-IN" w:eastAsia="en-IN"/>
+    </w:rPr>
+  </w:style>
+  <w:style w:type="character" w:styleId="Strong">
+    <w:name w:val="Strong"/>
+    <w:basedOn w:val="DefaultParagraphFont"/>
+    <w:uiPriority w:val="22"/>
+    <w:qFormat/>
+    <w:rsid w:val="00661575"/>
+    <w:rPr>
+      <w:b/>
+      <w:bCs/>
     </w:rPr>
   </w:style>
 </w:styles>

</xml_diff>